<commit_message>
docs: Atualização da documentação da API para a V0.7.0-alpha
</commit_message>
<xml_diff>
--- a/docs/Documentação Agro família Pesca.docx
+++ b/docs/Documentação Agro família Pesca.docx
@@ -825,15 +825,34 @@
           <w:ilvl w:val="1"/>
           <w:numId w:val="14"/>
         </w:numPr>
+        <w:spacing w:after="0" w:afterAutospacing="0" w:lineRule="auto"/>
+        <w:ind w:left="1440" w:hanging="360"/>
+        <w:rPr/>
+      </w:pPr>
+      <w:r>
+        <w:rPr>
+          <w:rtl w:val="0"/>
+        </w:rPr>
+        <w:t xml:space="preserve">Orquestrar chamadas ao repositório</w:t>
+      </w:r>
+    </w:p>
+    <w:p>
+      <w:pPr>
+        <w:numPr>
+          <w:ilvl w:val="1"/>
+          <w:numId w:val="14"/>
+        </w:numPr>
         <w:spacing w:after="240" w:lineRule="auto"/>
         <w:ind w:left="1440" w:hanging="360"/>
-        <w:rPr/>
-      </w:pPr>
-      <w:r>
-        <w:rPr>
-          <w:rtl w:val="0"/>
-        </w:rPr>
-        <w:t xml:space="preserve">Orquestrar chamadas ao repositório</w:t>
+        <w:rPr>
+          <w:u w:val="none"/>
+        </w:rPr>
+      </w:pPr>
+      <w:r>
+        <w:rPr>
+          <w:rtl w:val="0"/>
+        </w:rPr>
+        <w:t xml:space="preserve">Coordenar operações que dependem do contexto de acesso</w:t>
       </w:r>
     </w:p>
     <w:p>
@@ -886,7 +905,7 @@
       <w:pPr>
         <w:numPr>
           <w:ilvl w:val="0"/>
-          <w:numId w:val="44"/>
+          <w:numId w:val="46"/>
         </w:numPr>
         <w:spacing w:after="0" w:afterAutospacing="0" w:lineRule="auto"/>
         <w:ind w:left="720" w:hanging="360"/>
@@ -911,7 +930,7 @@
       <w:pPr>
         <w:numPr>
           <w:ilvl w:val="0"/>
-          <w:numId w:val="44"/>
+          <w:numId w:val="46"/>
         </w:numPr>
         <w:spacing w:after="0" w:afterAutospacing="0" w:lineRule="auto"/>
         <w:ind w:left="720" w:hanging="360"/>
@@ -936,7 +955,7 @@
       <w:pPr>
         <w:numPr>
           <w:ilvl w:val="1"/>
-          <w:numId w:val="44"/>
+          <w:numId w:val="46"/>
         </w:numPr>
         <w:spacing w:after="0" w:afterAutospacing="0" w:lineRule="auto"/>
         <w:ind w:left="1440" w:hanging="360"/>
@@ -953,7 +972,7 @@
       <w:pPr>
         <w:numPr>
           <w:ilvl w:val="1"/>
-          <w:numId w:val="44"/>
+          <w:numId w:val="46"/>
         </w:numPr>
         <w:spacing w:after="240" w:lineRule="auto"/>
         <w:ind w:left="1440" w:hanging="360"/>
@@ -997,7 +1016,13 @@
         <w:rPr>
           <w:rtl w:val="0"/>
         </w:rPr>
-        <w:t xml:space="preserve">Contém recursos reutilizáveis por todo o sistema.</w:t>
+        <w:t xml:space="preserve">Contém componentes e recursos reutilizáveis por diferentes módulos da aplicação</w:t>
+      </w:r>
+      <w:r>
+        <w:rPr>
+          <w:rtl w:val="0"/>
+        </w:rPr>
+        <w:t xml:space="preserve">.</w:t>
       </w:r>
     </w:p>
     <w:p>
@@ -1050,13 +1075,15 @@
         </w:numPr>
         <w:spacing w:after="0" w:afterAutospacing="0" w:lineRule="auto"/>
         <w:ind w:left="1440" w:hanging="360"/>
-        <w:rPr/>
-      </w:pPr>
-      <w:r>
-        <w:rPr>
-          <w:rtl w:val="0"/>
-        </w:rPr>
-        <w:t xml:space="preserve">Errors</w:t>
+        <w:rPr>
+          <w:u w:val="none"/>
+        </w:rPr>
+      </w:pPr>
+      <w:r>
+        <w:rPr>
+          <w:rtl w:val="0"/>
+        </w:rPr>
+        <w:t xml:space="preserve">BaseScope</w:t>
       </w:r>
     </w:p>
     <w:p>
@@ -1073,7 +1100,7 @@
         <w:rPr>
           <w:rtl w:val="0"/>
         </w:rPr>
-        <w:t xml:space="preserve">validationsUtils</w:t>
+        <w:t xml:space="preserve">Errors</w:t>
       </w:r>
     </w:p>
     <w:p>
@@ -1082,6 +1109,23 @@
           <w:ilvl w:val="1"/>
           <w:numId w:val="24"/>
         </w:numPr>
+        <w:spacing w:after="0" w:afterAutospacing="0" w:lineRule="auto"/>
+        <w:ind w:left="1440" w:hanging="360"/>
+        <w:rPr/>
+      </w:pPr>
+      <w:r>
+        <w:rPr>
+          <w:rtl w:val="0"/>
+        </w:rPr>
+        <w:t xml:space="preserve">validationsUtils</w:t>
+      </w:r>
+    </w:p>
+    <w:p>
+      <w:pPr>
+        <w:numPr>
+          <w:ilvl w:val="1"/>
+          <w:numId w:val="24"/>
+        </w:numPr>
         <w:spacing w:after="240" w:lineRule="auto"/>
         <w:ind w:left="1440" w:hanging="360"/>
         <w:rPr/>
@@ -1095,6 +1139,239 @@
     </w:p>
     <w:p>
       <w:pPr>
+        <w:pStyle w:val="Heading4"/>
+        <w:spacing w:after="240" w:lineRule="auto"/>
+        <w:rPr>
+          <w:b w:val="1"/>
+          <w:bCs w:val="1"/>
+          <w:color w:val="000000"/>
+        </w:rPr>
+      </w:pPr>
+      <w:bookmarkStart w:colFirst="0" w:colLast="0" w:name="_ivg6weyrec3q" w:id="14"/>
+      <w:bookmarkEnd w:id="14"/>
+      <w:r>
+        <w:rPr>
+          <w:b w:val="1"/>
+          <w:bCs w:val="1"/>
+          <w:color w:val="000000"/>
+          <w:rtl w:val="0"/>
+        </w:rPr>
+        <w:t xml:space="preserve">4.2.5 Controle de Escopo (BaseScope)</w:t>
+      </w:r>
+    </w:p>
+    <w:p>
+      <w:pPr>
+        <w:rPr/>
+      </w:pPr>
+      <w:r>
+        <w:rPr>
+          <w:rtl w:val="0"/>
+        </w:rPr>
+        <w:t xml:space="preserve">O sistema utiliza o componente </w:t>
+      </w:r>
+      <w:r>
+        <w:rPr>
+          <w:b w:val="1"/>
+          <w:bCs w:val="1"/>
+          <w:rtl w:val="0"/>
+        </w:rPr>
+        <w:t xml:space="preserve">BaseScope </w:t>
+      </w:r>
+      <w:r>
+        <w:rPr>
+          <w:rtl w:val="0"/>
+        </w:rPr>
+        <w:t xml:space="preserve">para aplicar restrições de acesso diretamente nas consultas realizadas ao banco de dados.</w:t>
+      </w:r>
+    </w:p>
+    <w:p>
+      <w:pPr>
+        <w:rPr/>
+      </w:pPr>
+      <w:r>
+        <w:rPr>
+          <w:rtl w:val="0"/>
+        </w:rPr>
+      </w:r>
+    </w:p>
+    <w:p>
+      <w:pPr>
+        <w:rPr/>
+      </w:pPr>
+      <w:r>
+        <w:rPr>
+          <w:rtl w:val="0"/>
+        </w:rPr>
+        <w:t xml:space="preserve">A implementação atual substitui a abordagem anterior utilizada pelo </w:t>
+      </w:r>
+      <w:r>
+        <w:rPr>
+          <w:b w:val="1"/>
+          <w:bCs w:val="1"/>
+          <w:rtl w:val="0"/>
+        </w:rPr>
+        <w:t xml:space="preserve">BaseService</w:t>
+      </w:r>
+      <w:r>
+        <w:rPr>
+          <w:rtl w:val="0"/>
+        </w:rPr>
+        <w:t xml:space="preserve">, na qual os dados eram consultados primeiro e filtrados posteriormente pela aplicação.</w:t>
+      </w:r>
+    </w:p>
+    <w:p>
+      <w:pPr>
+        <w:rPr/>
+      </w:pPr>
+      <w:r>
+        <w:rPr>
+          <w:rtl w:val="0"/>
+        </w:rPr>
+      </w:r>
+    </w:p>
+    <w:p>
+      <w:pPr>
+        <w:rPr/>
+      </w:pPr>
+      <w:r>
+        <w:rPr>
+          <w:rtl w:val="0"/>
+        </w:rPr>
+        <w:t xml:space="preserve">Com o </w:t>
+      </w:r>
+      <w:r>
+        <w:rPr>
+          <w:b w:val="1"/>
+          <w:bCs w:val="1"/>
+          <w:rtl w:val="0"/>
+        </w:rPr>
+        <w:t xml:space="preserve">BaseScope</w:t>
+      </w:r>
+      <w:r>
+        <w:rPr>
+          <w:rtl w:val="0"/>
+        </w:rPr>
+        <w:t xml:space="preserve">, as condições de escopo são incorporadas à própria consulta, permitindo que o banco de dados retorne somente os registros compatíveis com o contexto de acesso do usuário.</w:t>
+      </w:r>
+    </w:p>
+    <w:p>
+      <w:pPr>
+        <w:rPr/>
+      </w:pPr>
+      <w:r>
+        <w:rPr>
+          <w:rtl w:val="0"/>
+        </w:rPr>
+      </w:r>
+    </w:p>
+    <w:p>
+      <w:pPr>
+        <w:rPr/>
+      </w:pPr>
+      <w:r>
+        <w:rPr>
+          <w:rtl w:val="0"/>
+        </w:rPr>
+        <w:t xml:space="preserve">Essa abordagem proporciona:</w:t>
+      </w:r>
+    </w:p>
+    <w:p>
+      <w:pPr>
+        <w:numPr>
+          <w:ilvl w:val="0"/>
+          <w:numId w:val="30"/>
+        </w:numPr>
+        <w:ind w:left="720" w:hanging="360"/>
+        <w:rPr>
+          <w:u w:val="none"/>
+        </w:rPr>
+      </w:pPr>
+      <w:r>
+        <w:rPr>
+          <w:rtl w:val="0"/>
+        </w:rPr>
+        <w:t xml:space="preserve">Redução da quantidade de dados retornados pelo banco;</w:t>
+      </w:r>
+    </w:p>
+    <w:p>
+      <w:pPr>
+        <w:numPr>
+          <w:ilvl w:val="0"/>
+          <w:numId w:val="30"/>
+        </w:numPr>
+        <w:ind w:left="720" w:hanging="360"/>
+        <w:rPr>
+          <w:u w:val="none"/>
+        </w:rPr>
+      </w:pPr>
+      <w:r>
+        <w:rPr>
+          <w:rtl w:val="0"/>
+        </w:rPr>
+        <w:t xml:space="preserve">Redução do processamento realizado pela aplicação;</w:t>
+      </w:r>
+    </w:p>
+    <w:p>
+      <w:pPr>
+        <w:numPr>
+          <w:ilvl w:val="0"/>
+          <w:numId w:val="30"/>
+        </w:numPr>
+        <w:ind w:left="720" w:hanging="360"/>
+        <w:rPr>
+          <w:u w:val="none"/>
+        </w:rPr>
+      </w:pPr>
+      <w:r>
+        <w:rPr>
+          <w:rtl w:val="0"/>
+        </w:rPr>
+        <w:t xml:space="preserve">Melhoria da performance das consultas;</w:t>
+      </w:r>
+    </w:p>
+    <w:p>
+      <w:pPr>
+        <w:numPr>
+          <w:ilvl w:val="0"/>
+          <w:numId w:val="30"/>
+        </w:numPr>
+        <w:ind w:left="720" w:hanging="360"/>
+        <w:rPr>
+          <w:u w:val="none"/>
+        </w:rPr>
+      </w:pPr>
+      <w:r>
+        <w:rPr>
+          <w:rtl w:val="0"/>
+        </w:rPr>
+        <w:t xml:space="preserve">Maior isolamento dos dados;</w:t>
+      </w:r>
+    </w:p>
+    <w:p>
+      <w:pPr>
+        <w:numPr>
+          <w:ilvl w:val="0"/>
+          <w:numId w:val="30"/>
+        </w:numPr>
+        <w:ind w:left="720" w:hanging="360"/>
+        <w:rPr>
+          <w:u w:val="none"/>
+        </w:rPr>
+      </w:pPr>
+      <w:r>
+        <w:rPr>
+          <w:rtl w:val="0"/>
+        </w:rPr>
+        <w:t xml:space="preserve">Redução do risco de carregamento de informações fora do escopo autorizado.</w:t>
+      </w:r>
+      <w:r>
+        <w:rPr>
+          <w:rtl w:val="0"/>
+        </w:rPr>
+      </w:r>
+    </w:p>
+    <w:p>
+      <w:pPr>
         <w:spacing w:after="240" w:lineRule="auto"/>
         <w:ind w:left="1440" w:firstLine="0"/>
         <w:rPr/>
@@ -1107,6 +1384,45 @@
     </w:p>
     <w:p>
       <w:pPr>
+        <w:spacing w:after="240" w:lineRule="auto"/>
+        <w:rPr/>
+      </w:pPr>
+      <w:r>
+        <w:rPr>
+          <w:rtl w:val="0"/>
+        </w:rPr>
+        <w:t xml:space="preserve">O mecanismo é aplicado de forma transversal aos endpoints que realizam consultas, e não apenas ao módulo de usuários.</w:t>
+      </w:r>
+    </w:p>
+    <w:p>
+      <w:pPr>
+        <w:spacing w:after="240" w:lineRule="auto"/>
+        <w:ind w:left="0" w:firstLine="0"/>
+        <w:rPr/>
+      </w:pPr>
+      <w:r>
+        <w:rPr>
+          <w:rtl w:val="0"/>
+        </w:rPr>
+        <w:t xml:space="preserve">Quando aplicável, o escopo </w:t>
+      </w:r>
+      <w:r>
+        <w:rPr>
+          <w:b w:val="1"/>
+          <w:bCs w:val="1"/>
+          <w:rtl w:val="0"/>
+        </w:rPr>
+        <w:t xml:space="preserve">own </w:t>
+      </w:r>
+      <w:r>
+        <w:rPr>
+          <w:rtl w:val="0"/>
+        </w:rPr>
+        <w:t xml:space="preserve">restringe a consulta aos registros pertencentes ao próprio usuário.</w:t>
+      </w:r>
+    </w:p>
+    <w:p>
+      <w:pPr>
         <w:pStyle w:val="Heading2"/>
         <w:spacing w:after="240" w:before="240" w:lineRule="auto"/>
         <w:rPr>
@@ -1114,8 +1430,8 @@
           <w:bCs w:val="1"/>
         </w:rPr>
       </w:pPr>
-      <w:bookmarkStart w:colFirst="0" w:colLast="0" w:name="_6r1q028ur6ro" w:id="14"/>
-      <w:bookmarkEnd w:id="14"/>
+      <w:bookmarkStart w:colFirst="0" w:colLast="0" w:name="_6r1q028ur6ro" w:id="15"/>
+      <w:bookmarkEnd w:id="15"/>
       <w:r>
         <w:rPr>
           <w:b w:val="1"/>
@@ -1135,8 +1451,8 @@
           <w:color w:val="000000"/>
         </w:rPr>
       </w:pPr>
-      <w:bookmarkStart w:colFirst="0" w:colLast="0" w:name="_y72507ojzybu" w:id="15"/>
-      <w:bookmarkEnd w:id="15"/>
+      <w:bookmarkStart w:colFirst="0" w:colLast="0" w:name="_y72507ojzybu" w:id="16"/>
+      <w:bookmarkEnd w:id="16"/>
       <w:r>
         <w:rPr>
           <w:b w:val="1"/>
@@ -1177,7 +1493,7 @@
       <w:pPr>
         <w:numPr>
           <w:ilvl w:val="0"/>
-          <w:numId w:val="34"/>
+          <w:numId w:val="36"/>
         </w:numPr>
         <w:spacing w:after="0" w:afterAutospacing="0" w:lineRule="auto"/>
         <w:ind w:left="720" w:hanging="360"/>
@@ -1202,7 +1518,7 @@
       <w:pPr>
         <w:numPr>
           <w:ilvl w:val="0"/>
-          <w:numId w:val="34"/>
+          <w:numId w:val="36"/>
         </w:numPr>
         <w:spacing w:after="0" w:afterAutospacing="0" w:lineRule="auto"/>
         <w:ind w:left="720" w:hanging="360"/>
@@ -1219,7 +1535,7 @@
       <w:pPr>
         <w:numPr>
           <w:ilvl w:val="0"/>
-          <w:numId w:val="34"/>
+          <w:numId w:val="36"/>
         </w:numPr>
         <w:spacing w:after="240" w:lineRule="auto"/>
         <w:ind w:left="720" w:hanging="360"/>
@@ -1254,8 +1570,8 @@
           <w:szCs w:val="26"/>
         </w:rPr>
       </w:pPr>
-      <w:bookmarkStart w:colFirst="0" w:colLast="0" w:name="_7f0v3mnlxx0a" w:id="16"/>
-      <w:bookmarkEnd w:id="16"/>
+      <w:bookmarkStart w:colFirst="0" w:colLast="0" w:name="_7f0v3mnlxx0a" w:id="17"/>
+      <w:bookmarkEnd w:id="17"/>
       <w:r>
         <w:rPr>
           <w:b w:val="1"/>
@@ -1506,8 +1822,8 @@
           <w:color w:val="000000"/>
         </w:rPr>
       </w:pPr>
-      <w:bookmarkStart w:colFirst="0" w:colLast="0" w:name="_yrazdf1m2bp1" w:id="17"/>
-      <w:bookmarkEnd w:id="17"/>
+      <w:bookmarkStart w:colFirst="0" w:colLast="0" w:name="_yrazdf1m2bp1" w:id="18"/>
+      <w:bookmarkEnd w:id="18"/>
       <w:r>
         <w:rPr>
           <w:b w:val="1"/>
@@ -1527,35 +1843,24 @@
         <w:rPr>
           <w:rtl w:val="0"/>
         </w:rPr>
-        <w:t xml:space="preserve">O modelo de autorização é baseado em </w:t>
-      </w:r>
-      <w:r>
-        <w:rPr>
-          <w:b w:val="1"/>
-          <w:bCs w:val="1"/>
-          <w:rtl w:val="0"/>
-        </w:rPr>
-        <w:t xml:space="preserve">RBAC (Role-Based Access Control)</w:t>
-      </w:r>
-      <w:r>
-        <w:rPr>
-          <w:rtl w:val="0"/>
-        </w:rPr>
-        <w:t xml:space="preserve"> combinado com </w:t>
-      </w:r>
-      <w:r>
-        <w:rPr>
-          <w:b w:val="1"/>
-          <w:bCs w:val="1"/>
-          <w:rtl w:val="0"/>
-        </w:rPr>
-        <w:t xml:space="preserve">escopo contextual</w:t>
-      </w:r>
-      <w:r>
-        <w:rPr>
-          <w:rtl w:val="0"/>
-        </w:rPr>
-        <w:t xml:space="preserve">.</w:t>
+        <w:t xml:space="preserve">O RBAC define as permissões associadas ao nível do usuário, enquanto o escopo contextual restringe os registros que podem ser acessados dentro dessas permissões.</w:t>
+      </w:r>
+    </w:p>
+    <w:p>
+      <w:pPr>
+        <w:spacing w:after="240" w:before="240" w:lineRule="auto"/>
+        <w:rPr/>
+      </w:pPr>
+      <w:r>
+        <w:rPr>
+          <w:rtl w:val="0"/>
+        </w:rPr>
+        <w:t xml:space="preserve">Assim, autorização e filtragem de dados são tratadas como mecanismos complementares.</w:t>
+      </w:r>
+      <w:r>
+        <w:rPr>
+          <w:rtl w:val="0"/>
+        </w:rPr>
       </w:r>
     </w:p>
     <w:p>
@@ -1887,8 +2192,8 @@
           <w:color w:val="000000"/>
         </w:rPr>
       </w:pPr>
-      <w:bookmarkStart w:colFirst="0" w:colLast="0" w:name="_tp94mjlwlegn" w:id="18"/>
-      <w:bookmarkEnd w:id="18"/>
+      <w:bookmarkStart w:colFirst="0" w:colLast="0" w:name="_tp94mjlwlegn" w:id="19"/>
+      <w:bookmarkEnd w:id="19"/>
       <w:r>
         <w:rPr>
           <w:b w:val="1"/>
@@ -1908,21 +2213,379 @@
         <w:rPr>
           <w:rtl w:val="0"/>
         </w:rPr>
-        <w:t xml:space="preserve">O sistema utiliza o padrão </w:t>
-      </w:r>
-      <w:r>
-        <w:rPr>
-          <w:b w:val="1"/>
-          <w:bCs w:val="1"/>
-          <w:rtl w:val="0"/>
-        </w:rPr>
-        <w:t xml:space="preserve">Scope</w:t>
-      </w:r>
-      <w:r>
-        <w:rPr>
-          <w:rtl w:val="0"/>
-        </w:rPr>
-        <w:t xml:space="preserve">, implementado no BaseService.applyScope, garantindo que cada usuário visualize apenas dados compatíveis com sua Secretária ou Associação.</w:t>
+        <w:t xml:space="preserve">Além do controle de acesso baseado em papéis (RBAC), a API utiliza </w:t>
+      </w:r>
+      <w:r>
+        <w:rPr>
+          <w:b w:val="1"/>
+          <w:bCs w:val="1"/>
+          <w:rtl w:val="0"/>
+        </w:rPr>
+        <w:t xml:space="preserve">escopo contextual de dados</w:t>
+      </w:r>
+      <w:r>
+        <w:rPr>
+          <w:rtl w:val="0"/>
+        </w:rPr>
+        <w:t xml:space="preserve">.</w:t>
+      </w:r>
+    </w:p>
+    <w:p>
+      <w:pPr>
+        <w:spacing w:after="240" w:before="240" w:lineRule="auto"/>
+        <w:rPr/>
+      </w:pPr>
+      <w:r>
+        <w:rPr>
+          <w:rtl w:val="0"/>
+        </w:rPr>
+        <w:t xml:space="preserve">O mecanismo é implementado através do </w:t>
+      </w:r>
+      <w:r>
+        <w:rPr>
+          <w:b w:val="1"/>
+          <w:bCs w:val="1"/>
+          <w:rtl w:val="0"/>
+        </w:rPr>
+        <w:t xml:space="preserve">BaseScope</w:t>
+      </w:r>
+      <w:r>
+        <w:rPr>
+          <w:rtl w:val="0"/>
+        </w:rPr>
+        <w:t xml:space="preserve">, responsável por aplicar os filtros de acesso diretamente nas consultas ao banco de dados.</w:t>
+      </w:r>
+    </w:p>
+    <w:p>
+      <w:pPr>
+        <w:spacing w:after="240" w:before="240" w:lineRule="auto"/>
+        <w:rPr/>
+      </w:pPr>
+      <w:r>
+        <w:rPr>
+          <w:rtl w:val="0"/>
+        </w:rPr>
+        <w:t xml:space="preserve">Dessa forma, os endpoints que realizam consultas retornam somente informações compatíveis com o escopo do usuário autenticado.</w:t>
+      </w:r>
+    </w:p>
+    <w:p>
+      <w:pPr>
+        <w:spacing w:after="240" w:before="240" w:lineRule="auto"/>
+        <w:rPr/>
+      </w:pPr>
+      <w:r>
+        <w:rPr>
+          <w:rtl w:val="0"/>
+        </w:rPr>
+        <w:t xml:space="preserve">Entre os escopos utilizados está o </w:t>
+      </w:r>
+      <w:r>
+        <w:rPr>
+          <w:b w:val="1"/>
+          <w:bCs w:val="1"/>
+          <w:rtl w:val="0"/>
+        </w:rPr>
+        <w:t xml:space="preserve">own</w:t>
+      </w:r>
+      <w:r>
+        <w:rPr>
+          <w:rtl w:val="0"/>
+        </w:rPr>
+        <w:t xml:space="preserve">, que restringe o acesso aos dados pertencentes ao próprio usuário quando essa regra se aplica ao recurso consultado.</w:t>
+      </w:r>
+    </w:p>
+    <w:p>
+      <w:pPr>
+        <w:spacing w:after="240" w:before="240" w:lineRule="auto"/>
+        <w:rPr/>
+      </w:pPr>
+      <w:r>
+        <w:rPr>
+          <w:rtl w:val="0"/>
+        </w:rPr>
+        <w:t xml:space="preserve">A aplicação do escopo diretamente na consulta substitui a abordagem anterior, na qual os dados eram recuperados e filtrados posteriormente pela aplicação.</w:t>
+      </w:r>
+    </w:p>
+    <w:p>
+      <w:pPr>
+        <w:spacing w:after="240" w:before="240" w:lineRule="auto"/>
+        <w:rPr/>
+      </w:pPr>
+      <w:r>
+        <w:rPr>
+          <w:rtl w:val="0"/>
+        </w:rPr>
+        <w:t xml:space="preserve">Essa mudança melhora:</w:t>
+      </w:r>
+    </w:p>
+    <w:p>
+      <w:pPr>
+        <w:numPr>
+          <w:ilvl w:val="0"/>
+          <w:numId w:val="34"/>
+        </w:numPr>
+        <w:spacing w:after="0" w:afterAutospacing="0" w:before="240" w:lineRule="auto"/>
+        <w:ind w:left="720" w:hanging="360"/>
+        <w:rPr>
+          <w:u w:val="none"/>
+        </w:rPr>
+      </w:pPr>
+      <w:r>
+        <w:rPr>
+          <w:b w:val="1"/>
+          <w:bCs w:val="1"/>
+          <w:rtl w:val="0"/>
+        </w:rPr>
+        <w:t xml:space="preserve">Performance</w:t>
+      </w:r>
+      <w:r>
+        <w:rPr>
+          <w:rtl w:val="0"/>
+        </w:rPr>
+        <w:t xml:space="preserve">, reduzindo o volume de dados transferidos e processados;</w:t>
+      </w:r>
+    </w:p>
+    <w:p>
+      <w:pPr>
+        <w:numPr>
+          <w:ilvl w:val="0"/>
+          <w:numId w:val="34"/>
+        </w:numPr>
+        <w:spacing w:after="0" w:afterAutospacing="0" w:before="0" w:beforeAutospacing="0" w:lineRule="auto"/>
+        <w:ind w:left="720" w:hanging="360"/>
+        <w:rPr>
+          <w:u w:val="none"/>
+        </w:rPr>
+      </w:pPr>
+      <w:r>
+        <w:rPr>
+          <w:b w:val="1"/>
+          <w:bCs w:val="1"/>
+          <w:rtl w:val="0"/>
+        </w:rPr>
+        <w:t xml:space="preserve">Segurança</w:t>
+      </w:r>
+      <w:r>
+        <w:rPr>
+          <w:rtl w:val="0"/>
+        </w:rPr>
+        <w:t xml:space="preserve">, evitando o carregamento desnecessário de registros fora do escopo;</w:t>
+      </w:r>
+    </w:p>
+    <w:p>
+      <w:pPr>
+        <w:numPr>
+          <w:ilvl w:val="0"/>
+          <w:numId w:val="34"/>
+        </w:numPr>
+        <w:spacing w:after="0" w:afterAutospacing="0" w:before="0" w:beforeAutospacing="0" w:lineRule="auto"/>
+        <w:ind w:left="720" w:hanging="360"/>
+        <w:rPr>
+          <w:u w:val="none"/>
+        </w:rPr>
+      </w:pPr>
+      <w:r>
+        <w:rPr>
+          <w:b w:val="1"/>
+          <w:bCs w:val="1"/>
+          <w:rtl w:val="0"/>
+        </w:rPr>
+        <w:t xml:space="preserve">Padronização</w:t>
+      </w:r>
+      <w:r>
+        <w:rPr>
+          <w:rtl w:val="0"/>
+        </w:rPr>
+        <w:t xml:space="preserve">, centralizando a aplicação das regras de escopo;</w:t>
+      </w:r>
+    </w:p>
+    <w:p>
+      <w:pPr>
+        <w:numPr>
+          <w:ilvl w:val="0"/>
+          <w:numId w:val="34"/>
+        </w:numPr>
+        <w:spacing w:after="240" w:before="0" w:beforeAutospacing="0" w:lineRule="auto"/>
+        <w:ind w:left="720" w:hanging="360"/>
+        <w:rPr>
+          <w:u w:val="none"/>
+        </w:rPr>
+      </w:pPr>
+      <w:r>
+        <w:rPr>
+          <w:b w:val="1"/>
+          <w:bCs w:val="1"/>
+          <w:rtl w:val="0"/>
+        </w:rPr>
+        <w:t xml:space="preserve">Manutenibilidade</w:t>
+      </w:r>
+      <w:r>
+        <w:rPr>
+          <w:rtl w:val="0"/>
+        </w:rPr>
+        <w:t xml:space="preserve">, reduzindo a duplicação da lógica de filtragem entre os módulos.</w:t>
+      </w:r>
+      <w:r>
+        <w:rPr>
+          <w:rtl w:val="0"/>
+        </w:rPr>
+      </w:r>
+    </w:p>
+    <w:p>
+      <w:pPr>
+        <w:pStyle w:val="Heading3"/>
+        <w:spacing w:after="240" w:before="240" w:lineRule="auto"/>
+        <w:rPr>
+          <w:b w:val="1"/>
+          <w:bCs w:val="1"/>
+          <w:color w:val="000000"/>
+        </w:rPr>
+      </w:pPr>
+      <w:bookmarkStart w:colFirst="0" w:colLast="0" w:name="_wrih6mq66yyi" w:id="20"/>
+      <w:bookmarkEnd w:id="20"/>
+      <w:r>
+        <w:rPr>
+          <w:b w:val="1"/>
+          <w:bCs w:val="1"/>
+          <w:color w:val="000000"/>
+          <w:rtl w:val="0"/>
+        </w:rPr>
+        <w:t xml:space="preserve">5.4 Rate Limiting</w:t>
+      </w:r>
+    </w:p>
+    <w:p>
+      <w:pPr>
+        <w:spacing w:after="240" w:before="240" w:lineRule="auto"/>
+        <w:rPr/>
+      </w:pPr>
+      <w:r>
+        <w:rPr>
+          <w:rtl w:val="0"/>
+        </w:rPr>
+        <w:t xml:space="preserve">A rota de autenticação possui um mecanismo de rate limiting utilizando  </w:t>
+      </w:r>
+      <w:r>
+        <w:rPr>
+          <w:b w:val="1"/>
+          <w:bCs w:val="1"/>
+          <w:rtl w:val="0"/>
+        </w:rPr>
+        <w:t xml:space="preserve">express-rate-limit</w:t>
+      </w:r>
+      <w:r>
+        <w:rPr>
+          <w:rtl w:val="0"/>
+        </w:rPr>
+        <w:t xml:space="preserve">.</w:t>
+      </w:r>
+    </w:p>
+    <w:p>
+      <w:pPr>
+        <w:spacing w:after="240" w:before="240" w:lineRule="auto"/>
+        <w:rPr/>
+      </w:pPr>
+      <w:r>
+        <w:rPr>
+          <w:rtl w:val="0"/>
+        </w:rPr>
+        <w:t xml:space="preserve">O objetivo é limitar a quantidade de tentativas de login realizadas em determinado intervalo, reduzindo a exposição da API a ataques de força bruta e tentativas automatizadas de autenticação.</w:t>
+      </w:r>
+    </w:p>
+    <w:p>
+      <w:pPr>
+        <w:pStyle w:val="Heading3"/>
+        <w:spacing w:after="240" w:before="240" w:lineRule="auto"/>
+        <w:rPr>
+          <w:b w:val="1"/>
+          <w:bCs w:val="1"/>
+          <w:color w:val="000000"/>
+        </w:rPr>
+      </w:pPr>
+      <w:bookmarkStart w:colFirst="0" w:colLast="0" w:name="_6apz58qk9zhh" w:id="21"/>
+      <w:bookmarkEnd w:id="21"/>
+      <w:r>
+        <w:rPr>
+          <w:b w:val="1"/>
+          <w:bCs w:val="1"/>
+          <w:color w:val="000000"/>
+          <w:rtl w:val="0"/>
+        </w:rPr>
+        <w:t xml:space="preserve">5.5 Observabilidade e Logs</w:t>
+      </w:r>
+    </w:p>
+    <w:p>
+      <w:pPr>
+        <w:spacing w:after="240" w:before="240" w:lineRule="auto"/>
+        <w:rPr/>
+      </w:pPr>
+      <w:r>
+        <w:rPr>
+          <w:rtl w:val="0"/>
+        </w:rPr>
+        <w:t xml:space="preserve">A API utiliza </w:t>
+      </w:r>
+      <w:r>
+        <w:rPr>
+          <w:b w:val="1"/>
+          <w:bCs w:val="1"/>
+          <w:rtl w:val="0"/>
+        </w:rPr>
+        <w:t xml:space="preserve">Pino</w:t>
+      </w:r>
+      <w:r>
+        <w:rPr>
+          <w:rtl w:val="0"/>
+        </w:rPr>
+        <w:t xml:space="preserve"> e </w:t>
+      </w:r>
+      <w:r>
+        <w:rPr>
+          <w:b w:val="1"/>
+          <w:bCs w:val="1"/>
+          <w:rtl w:val="0"/>
+        </w:rPr>
+        <w:t xml:space="preserve">Pino HTTP</w:t>
+      </w:r>
+      <w:r>
+        <w:rPr>
+          <w:rtl w:val="0"/>
+        </w:rPr>
+        <w:t xml:space="preserve"> para geração de logs estruturados.</w:t>
+      </w:r>
+    </w:p>
+    <w:p>
+      <w:pPr>
+        <w:spacing w:after="240" w:before="240" w:lineRule="auto"/>
+        <w:rPr/>
+      </w:pPr>
+      <w:r>
+        <w:rPr>
+          <w:rtl w:val="0"/>
+        </w:rPr>
+        <w:t xml:space="preserve">O mecanismo permite registrar eventos e requisições de forma padronizada, facilitando diagnóstico, monitoramento e auditoria da aplicação.</w:t>
+      </w:r>
+    </w:p>
+    <w:p>
+      <w:pPr>
+        <w:spacing w:after="240" w:before="240" w:lineRule="auto"/>
+        <w:rPr/>
+      </w:pPr>
+      <w:r>
+        <w:rPr>
+          <w:rtl w:val="0"/>
+        </w:rPr>
+        <w:t xml:space="preserve">Os logs são armazenados em diretório próprio, que não é versionado no repositório.</w:t>
+      </w:r>
+    </w:p>
+    <w:p>
+      <w:pPr>
+        <w:spacing w:after="240" w:before="240" w:lineRule="auto"/>
+        <w:rPr/>
+      </w:pPr>
+      <w:r>
+        <w:rPr>
+          <w:rtl w:val="0"/>
+        </w:rPr>
       </w:r>
     </w:p>
     <w:p>
@@ -1934,8 +2597,8 @@
           <w:bCs w:val="1"/>
         </w:rPr>
       </w:pPr>
-      <w:bookmarkStart w:colFirst="0" w:colLast="0" w:name="_hdwr9lra0zbs" w:id="19"/>
-      <w:bookmarkEnd w:id="19"/>
+      <w:bookmarkStart w:colFirst="0" w:colLast="0" w:name="_hdwr9lra0zbs" w:id="22"/>
+      <w:bookmarkEnd w:id="22"/>
       <w:r>
         <w:rPr>
           <w:b w:val="1"/>
@@ -1955,8 +2618,8 @@
           <w:color w:val="000000"/>
         </w:rPr>
       </w:pPr>
-      <w:bookmarkStart w:colFirst="0" w:colLast="0" w:name="_ymp8fij906rq" w:id="20"/>
-      <w:bookmarkEnd w:id="20"/>
+      <w:bookmarkStart w:colFirst="0" w:colLast="0" w:name="_ymp8fij906rq" w:id="23"/>
+      <w:bookmarkEnd w:id="23"/>
       <w:r>
         <w:rPr>
           <w:b w:val="1"/>
@@ -1991,7 +2654,7 @@
           <w:rFonts w:ascii="Arial Unicode MS" w:cs="Arial Unicode MS" w:eastAsia="Arial Unicode MS" w:hAnsi="Arial Unicode MS"/>
           <w:rtl w:val="0"/>
         </w:rPr>
-        <w:t xml:space="preserve">  ↓</w:t>
+        <w:t xml:space="preserve">   ↓</w:t>
       </w:r>
     </w:p>
     <w:p>
@@ -2018,7 +2681,7 @@
           <w:rFonts w:ascii="Arial Unicode MS" w:cs="Arial Unicode MS" w:eastAsia="Arial Unicode MS" w:hAnsi="Arial Unicode MS"/>
           <w:rtl w:val="0"/>
         </w:rPr>
-        <w:t xml:space="preserve">  ↓</w:t>
+        <w:t xml:space="preserve">   ↓</w:t>
       </w:r>
     </w:p>
     <w:p>
@@ -2045,7 +2708,7 @@
           <w:rFonts w:ascii="Arial Unicode MS" w:cs="Arial Unicode MS" w:eastAsia="Arial Unicode MS" w:hAnsi="Arial Unicode MS"/>
           <w:rtl w:val="0"/>
         </w:rPr>
-        <w:t xml:space="preserve">  ↓</w:t>
+        <w:t xml:space="preserve">   ↓</w:t>
       </w:r>
     </w:p>
     <w:p>
@@ -2072,7 +2735,7 @@
           <w:rFonts w:ascii="Arial Unicode MS" w:cs="Arial Unicode MS" w:eastAsia="Arial Unicode MS" w:hAnsi="Arial Unicode MS"/>
           <w:rtl w:val="0"/>
         </w:rPr>
-        <w:t xml:space="preserve">  ↓</w:t>
+        <w:t xml:space="preserve">   ↓</w:t>
       </w:r>
     </w:p>
     <w:p>
@@ -2085,7 +2748,7 @@
         <w:rPr>
           <w:rtl w:val="0"/>
         </w:rPr>
-        <w:t xml:space="preserve">Policy + Scope</w:t>
+        <w:t xml:space="preserve">Policy</w:t>
       </w:r>
     </w:p>
     <w:p>
@@ -2099,7 +2762,7 @@
           <w:rFonts w:ascii="Arial Unicode MS" w:cs="Arial Unicode MS" w:eastAsia="Arial Unicode MS" w:hAnsi="Arial Unicode MS"/>
           <w:rtl w:val="0"/>
         </w:rPr>
-        <w:t xml:space="preserve">  ↓</w:t>
+        <w:t xml:space="preserve">   ↓</w:t>
       </w:r>
     </w:p>
     <w:p>
@@ -2112,6 +2775,33 @@
         <w:rPr>
           <w:rtl w:val="0"/>
         </w:rPr>
+        <w:t xml:space="preserve">BaseScope</w:t>
+      </w:r>
+    </w:p>
+    <w:p>
+      <w:pPr>
+        <w:spacing w:after="240" w:before="240" w:lineRule="auto"/>
+        <w:jc w:val="center"/>
+        <w:rPr/>
+      </w:pPr>
+      <w:r>
+        <w:rPr>
+          <w:rFonts w:ascii="Arial Unicode MS" w:cs="Arial Unicode MS" w:eastAsia="Arial Unicode MS" w:hAnsi="Arial Unicode MS"/>
+          <w:rtl w:val="0"/>
+        </w:rPr>
+        <w:t xml:space="preserve">   ↓</w:t>
+      </w:r>
+    </w:p>
+    <w:p>
+      <w:pPr>
+        <w:spacing w:after="240" w:before="240" w:lineRule="auto"/>
+        <w:jc w:val="center"/>
+        <w:rPr/>
+      </w:pPr>
+      <w:r>
+        <w:rPr>
+          <w:rtl w:val="0"/>
+        </w:rPr>
         <w:t xml:space="preserve">Repository</w:t>
       </w:r>
     </w:p>
@@ -2126,7 +2816,7 @@
           <w:rFonts w:ascii="Arial Unicode MS" w:cs="Arial Unicode MS" w:eastAsia="Arial Unicode MS" w:hAnsi="Arial Unicode MS"/>
           <w:rtl w:val="0"/>
         </w:rPr>
-        <w:t xml:space="preserve">  ↓</w:t>
+        <w:t xml:space="preserve">   ↓</w:t>
       </w:r>
     </w:p>
     <w:p>
@@ -2135,13 +2825,19 @@
         <w:jc w:val="center"/>
         <w:rPr/>
       </w:pPr>
+      <w:r>
+        <w:rPr>
+          <w:rtl w:val="0"/>
+        </w:rPr>
+        <w:t xml:space="preserve">Banco de Dados </w:t>
+      </w:r>
       <w:r>
         <w:rPr>
           <w:sz w:val="22"/>
           <w:szCs w:val="22"/>
           <w:rtl w:val="0"/>
         </w:rPr>
-        <w:t xml:space="preserve">Banco de Dados (MySQL)</w:t>
+        <w:t xml:space="preserve">(MySQL)</w:t>
       </w:r>
       <w:r>
         <w:rPr>
@@ -2160,8 +2856,8 @@
           <w:color w:val="000000"/>
         </w:rPr>
       </w:pPr>
-      <w:bookmarkStart w:colFirst="0" w:colLast="0" w:name="_uazciq50ua3q" w:id="21"/>
-      <w:bookmarkEnd w:id="21"/>
+      <w:bookmarkStart w:colFirst="0" w:colLast="0" w:name="_uazciq50ua3q" w:id="24"/>
+      <w:bookmarkEnd w:id="24"/>
       <w:r>
         <w:rPr>
           <w:color w:val="000000"/>
@@ -2351,8 +3047,8 @@
           <w:bCs w:val="1"/>
         </w:rPr>
       </w:pPr>
-      <w:bookmarkStart w:colFirst="0" w:colLast="0" w:name="_okqoc9rh6c1u" w:id="22"/>
-      <w:bookmarkEnd w:id="22"/>
+      <w:bookmarkStart w:colFirst="0" w:colLast="0" w:name="_okqoc9rh6c1u" w:id="25"/>
+      <w:bookmarkEnd w:id="25"/>
       <w:r>
         <w:rPr>
           <w:b w:val="1"/>
@@ -2374,8 +3070,8 @@
           <w:color w:val="000000"/>
         </w:rPr>
       </w:pPr>
-      <w:bookmarkStart w:colFirst="0" w:colLast="0" w:name="_wd0gp6s23ok4" w:id="23"/>
-      <w:bookmarkEnd w:id="23"/>
+      <w:bookmarkStart w:colFirst="0" w:colLast="0" w:name="_wd0gp6s23ok4" w:id="26"/>
+      <w:bookmarkEnd w:id="26"/>
       <w:r>
         <w:rPr>
           <w:b w:val="1"/>
@@ -2462,8 +3158,8 @@
           <w:color w:val="000000"/>
         </w:rPr>
       </w:pPr>
-      <w:bookmarkStart w:colFirst="0" w:colLast="0" w:name="_9bsmhfg8e6qi" w:id="24"/>
-      <w:bookmarkEnd w:id="24"/>
+      <w:bookmarkStart w:colFirst="0" w:colLast="0" w:name="_9bsmhfg8e6qi" w:id="27"/>
+      <w:bookmarkEnd w:id="27"/>
       <w:r>
         <w:rPr>
           <w:b w:val="1"/>
@@ -2684,8 +3380,8 @@
           <w:color w:val="000000"/>
         </w:rPr>
       </w:pPr>
-      <w:bookmarkStart w:colFirst="0" w:colLast="0" w:name="_wj4buucaxrkr" w:id="25"/>
-      <w:bookmarkEnd w:id="25"/>
+      <w:bookmarkStart w:colFirst="0" w:colLast="0" w:name="_wj4buucaxrkr" w:id="28"/>
+      <w:bookmarkEnd w:id="28"/>
       <w:r>
         <w:rPr>
           <w:b w:val="1"/>
@@ -2706,8 +3402,8 @@
           <w:color w:val="000000"/>
         </w:rPr>
       </w:pPr>
-      <w:bookmarkStart w:colFirst="0" w:colLast="0" w:name="_yn2zjh3u1ebn" w:id="26"/>
-      <w:bookmarkEnd w:id="26"/>
+      <w:bookmarkStart w:colFirst="0" w:colLast="0" w:name="_yn2zjh3u1ebn" w:id="29"/>
+      <w:bookmarkEnd w:id="29"/>
       <w:r>
         <w:rPr>
           <w:b w:val="1"/>
@@ -2754,7 +3450,7 @@
       <w:pPr>
         <w:numPr>
           <w:ilvl w:val="0"/>
-          <w:numId w:val="41"/>
+          <w:numId w:val="43"/>
         </w:numPr>
         <w:spacing w:after="0" w:afterAutospacing="0" w:lineRule="auto"/>
         <w:ind w:left="720" w:hanging="360"/>
@@ -2771,7 +3467,7 @@
       <w:pPr>
         <w:numPr>
           <w:ilvl w:val="0"/>
-          <w:numId w:val="41"/>
+          <w:numId w:val="43"/>
         </w:numPr>
         <w:spacing w:after="0" w:afterAutospacing="0" w:lineRule="auto"/>
         <w:ind w:left="720" w:hanging="360"/>
@@ -2788,7 +3484,7 @@
       <w:pPr>
         <w:numPr>
           <w:ilvl w:val="0"/>
-          <w:numId w:val="41"/>
+          <w:numId w:val="43"/>
         </w:numPr>
         <w:spacing w:after="0" w:afterAutospacing="0" w:lineRule="auto"/>
         <w:ind w:left="720" w:hanging="360"/>
@@ -2805,7 +3501,7 @@
       <w:pPr>
         <w:numPr>
           <w:ilvl w:val="0"/>
-          <w:numId w:val="41"/>
+          <w:numId w:val="43"/>
         </w:numPr>
         <w:spacing w:after="0" w:afterAutospacing="0" w:lineRule="auto"/>
         <w:ind w:left="720" w:hanging="360"/>
@@ -2822,7 +3518,7 @@
       <w:pPr>
         <w:numPr>
           <w:ilvl w:val="0"/>
-          <w:numId w:val="41"/>
+          <w:numId w:val="43"/>
         </w:numPr>
         <w:spacing w:after="0" w:afterAutospacing="0" w:lineRule="auto"/>
         <w:ind w:left="720" w:hanging="360"/>
@@ -2839,7 +3535,7 @@
       <w:pPr>
         <w:numPr>
           <w:ilvl w:val="0"/>
-          <w:numId w:val="41"/>
+          <w:numId w:val="43"/>
         </w:numPr>
         <w:spacing w:after="240" w:lineRule="auto"/>
         <w:ind w:left="720" w:hanging="360"/>
@@ -2895,8 +3591,8 @@
           <w:color w:val="000000"/>
         </w:rPr>
       </w:pPr>
-      <w:bookmarkStart w:colFirst="0" w:colLast="0" w:name="_7rd3vp1uxvus" w:id="27"/>
-      <w:bookmarkEnd w:id="27"/>
+      <w:bookmarkStart w:colFirst="0" w:colLast="0" w:name="_7rd3vp1uxvus" w:id="30"/>
+      <w:bookmarkEnd w:id="30"/>
       <w:r>
         <w:rPr>
           <w:b w:val="1"/>
@@ -3119,8 +3815,8 @@
           <w:color w:val="000000"/>
         </w:rPr>
       </w:pPr>
-      <w:bookmarkStart w:colFirst="0" w:colLast="0" w:name="_jrm79qwfykvc" w:id="28"/>
-      <w:bookmarkEnd w:id="28"/>
+      <w:bookmarkStart w:colFirst="0" w:colLast="0" w:name="_jrm79qwfykvc" w:id="31"/>
+      <w:bookmarkEnd w:id="31"/>
       <w:r>
         <w:rPr>
           <w:b w:val="1"/>
@@ -3167,7 +3863,7 @@
       <w:pPr>
         <w:numPr>
           <w:ilvl w:val="0"/>
-          <w:numId w:val="42"/>
+          <w:numId w:val="44"/>
         </w:numPr>
         <w:spacing w:after="0" w:afterAutospacing="0" w:lineRule="auto"/>
         <w:ind w:left="720" w:hanging="360"/>
@@ -3184,7 +3880,7 @@
       <w:pPr>
         <w:numPr>
           <w:ilvl w:val="0"/>
-          <w:numId w:val="42"/>
+          <w:numId w:val="44"/>
         </w:numPr>
         <w:spacing w:after="0" w:afterAutospacing="0" w:lineRule="auto"/>
         <w:ind w:left="720" w:hanging="360"/>
@@ -3201,7 +3897,7 @@
       <w:pPr>
         <w:numPr>
           <w:ilvl w:val="0"/>
-          <w:numId w:val="42"/>
+          <w:numId w:val="44"/>
         </w:numPr>
         <w:spacing w:after="0" w:afterAutospacing="0" w:lineRule="auto"/>
         <w:ind w:left="720" w:hanging="360"/>
@@ -3218,7 +3914,7 @@
       <w:pPr>
         <w:numPr>
           <w:ilvl w:val="0"/>
-          <w:numId w:val="42"/>
+          <w:numId w:val="44"/>
         </w:numPr>
         <w:spacing w:after="0" w:afterAutospacing="0" w:lineRule="auto"/>
         <w:ind w:left="720" w:hanging="360"/>
@@ -3235,7 +3931,7 @@
       <w:pPr>
         <w:numPr>
           <w:ilvl w:val="0"/>
-          <w:numId w:val="42"/>
+          <w:numId w:val="44"/>
         </w:numPr>
         <w:spacing w:after="240" w:lineRule="auto"/>
         <w:ind w:left="720" w:hanging="360"/>
@@ -3258,8 +3954,8 @@
           <w:color w:val="000000"/>
         </w:rPr>
       </w:pPr>
-      <w:bookmarkStart w:colFirst="0" w:colLast="0" w:name="_4xmb6q3u9hsu" w:id="29"/>
-      <w:bookmarkEnd w:id="29"/>
+      <w:bookmarkStart w:colFirst="0" w:colLast="0" w:name="_4xmb6q3u9hsu" w:id="32"/>
+      <w:bookmarkEnd w:id="32"/>
       <w:r>
         <w:rPr>
           <w:b w:val="1"/>
@@ -3420,8 +4116,8 @@
           <w:color w:val="000000"/>
         </w:rPr>
       </w:pPr>
-      <w:bookmarkStart w:colFirst="0" w:colLast="0" w:name="_p4p5cbih2orf" w:id="30"/>
-      <w:bookmarkEnd w:id="30"/>
+      <w:bookmarkStart w:colFirst="0" w:colLast="0" w:name="_p4p5cbih2orf" w:id="33"/>
+      <w:bookmarkEnd w:id="33"/>
       <w:r>
         <w:rPr>
           <w:b w:val="1"/>
@@ -3627,8 +4323,8 @@
           <w:color w:val="000000"/>
         </w:rPr>
       </w:pPr>
-      <w:bookmarkStart w:colFirst="0" w:colLast="0" w:name="_849xof7m2vcr" w:id="31"/>
-      <w:bookmarkEnd w:id="31"/>
+      <w:bookmarkStart w:colFirst="0" w:colLast="0" w:name="_849xof7m2vcr" w:id="34"/>
+      <w:bookmarkEnd w:id="34"/>
       <w:r>
         <w:rPr>
           <w:b w:val="1"/>
@@ -3761,8 +4457,8 @@
           <w:color w:val="000000"/>
         </w:rPr>
       </w:pPr>
-      <w:bookmarkStart w:colFirst="0" w:colLast="0" w:name="_kk2pom27bs2g" w:id="32"/>
-      <w:bookmarkEnd w:id="32"/>
+      <w:bookmarkStart w:colFirst="0" w:colLast="0" w:name="_kk2pom27bs2g" w:id="35"/>
+      <w:bookmarkEnd w:id="35"/>
       <w:r>
         <w:rPr>
           <w:b w:val="1"/>
@@ -3877,8 +4573,8 @@
           <w:color w:val="000000"/>
         </w:rPr>
       </w:pPr>
-      <w:bookmarkStart w:colFirst="0" w:colLast="0" w:name="_d6gy2vjozdui" w:id="33"/>
-      <w:bookmarkEnd w:id="33"/>
+      <w:bookmarkStart w:colFirst="0" w:colLast="0" w:name="_d6gy2vjozdui" w:id="36"/>
+      <w:bookmarkEnd w:id="36"/>
       <w:r>
         <w:rPr>
           <w:b w:val="1"/>
@@ -4027,8 +4723,8 @@
           <w:color w:val="000000"/>
         </w:rPr>
       </w:pPr>
-      <w:bookmarkStart w:colFirst="0" w:colLast="0" w:name="_zangnzkii9j8" w:id="34"/>
-      <w:bookmarkEnd w:id="34"/>
+      <w:bookmarkStart w:colFirst="0" w:colLast="0" w:name="_zangnzkii9j8" w:id="37"/>
+      <w:bookmarkEnd w:id="37"/>
       <w:r>
         <w:rPr>
           <w:b w:val="1"/>
@@ -4206,72 +4902,359 @@
       <w:pPr>
         <w:pStyle w:val="Heading3"/>
         <w:spacing w:after="240" w:before="240" w:lineRule="auto"/>
+        <w:rPr/>
+      </w:pPr>
+      <w:bookmarkStart w:colFirst="0" w:colLast="0" w:name="_3iw7apeel8f3" w:id="38"/>
+      <w:bookmarkEnd w:id="38"/>
+      <w:r>
         <w:rPr>
           <w:b w:val="1"/>
           <w:bCs w:val="1"/>
           <w:color w:val="000000"/>
-        </w:rPr>
-      </w:pPr>
-      <w:bookmarkStart w:colFirst="0" w:colLast="0" w:name="_3iw7apeel8f3" w:id="35"/>
-      <w:bookmarkEnd w:id="35"/>
-      <w:r>
+          <w:rtl w:val="0"/>
+        </w:rPr>
+        <w:t xml:space="preserve">7.5 Uso de Views</w:t>
+      </w:r>
+      <w:r>
+        <w:rPr>
+          <w:rtl w:val="0"/>
+        </w:rPr>
+      </w:r>
+    </w:p>
+    <w:p>
+      <w:pPr>
+        <w:spacing w:after="240" w:before="240" w:lineRule="auto"/>
+        <w:rPr/>
+      </w:pPr>
+      <w:r>
+        <w:rPr>
+          <w:rtl w:val="0"/>
+        </w:rPr>
+        <w:t xml:space="preserve">As </w:t>
+      </w:r>
+      <w:r>
+        <w:rPr>
+          <w:b w:val="1"/>
+          <w:bCs w:val="1"/>
+          <w:rtl w:val="0"/>
+        </w:rPr>
+        <w:t xml:space="preserve">views</w:t>
+      </w:r>
+      <w:r>
+        <w:rPr>
+          <w:rtl w:val="0"/>
+        </w:rPr>
+        <w:t xml:space="preserve"> são utilizadas como camada de abstração para determinadas consultas de leitura, enquanto o </w:t>
+      </w:r>
+      <w:r>
+        <w:rPr>
+          <w:b w:val="1"/>
+          <w:bCs w:val="1"/>
+          <w:rtl w:val="0"/>
+        </w:rPr>
+        <w:t xml:space="preserve">BaseScope</w:t>
+      </w:r>
+      <w:r>
+        <w:rPr>
+          <w:rtl w:val="0"/>
+        </w:rPr>
+        <w:t xml:space="preserve"> é responsável por aplicar as restrições contextuais de acesso diretamente às consultas.</w:t>
+      </w:r>
+    </w:p>
+    <w:p>
+      <w:pPr>
+        <w:spacing w:after="240" w:before="240" w:lineRule="auto"/>
+        <w:rPr/>
+      </w:pPr>
+      <w:r>
+        <w:rPr>
+          <w:rtl w:val="0"/>
+        </w:rPr>
+        <w:t xml:space="preserve">Dessa forma, as </w:t>
+      </w:r>
+      <w:r>
+        <w:rPr>
+          <w:b w:val="1"/>
+          <w:bCs w:val="1"/>
+          <w:rtl w:val="0"/>
+        </w:rPr>
+        <w:t xml:space="preserve">views </w:t>
+      </w:r>
+      <w:r>
+        <w:rPr>
+          <w:rtl w:val="0"/>
+        </w:rPr>
+        <w:t xml:space="preserve">organizam e simplificam consultas complexas, enquanto o mecanismo de escopo controla quais registros podem ser retornados ao usuário.</w:t>
+      </w:r>
+    </w:p>
+    <w:p>
+      <w:pPr>
+        <w:spacing w:after="240" w:before="240" w:lineRule="auto"/>
+        <w:rPr>
+          <w:b w:val="1"/>
+          <w:bCs w:val="1"/>
+        </w:rPr>
+      </w:pPr>
+      <w:r>
+        <w:rPr>
+          <w:b w:val="1"/>
+          <w:bCs w:val="1"/>
+          <w:rtl w:val="0"/>
+        </w:rPr>
+        <w:t xml:space="preserve">Objetivos do uso de Views:</w:t>
+      </w:r>
+    </w:p>
+    <w:p>
+      <w:pPr>
+        <w:numPr>
+          <w:ilvl w:val="0"/>
+          <w:numId w:val="11"/>
+        </w:numPr>
+        <w:spacing w:after="0" w:afterAutospacing="0" w:lineRule="auto"/>
+        <w:ind w:left="720" w:hanging="360"/>
+        <w:rPr/>
+      </w:pPr>
+      <w:r>
+        <w:rPr>
+          <w:rtl w:val="0"/>
+        </w:rPr>
+        <w:t xml:space="preserve">Melhorar a legibilidade das consultas</w:t>
+      </w:r>
+    </w:p>
+    <w:p>
+      <w:pPr>
+        <w:numPr>
+          <w:ilvl w:val="0"/>
+          <w:numId w:val="11"/>
+        </w:numPr>
+        <w:spacing w:after="0" w:afterAutospacing="0" w:lineRule="auto"/>
+        <w:ind w:left="720" w:hanging="360"/>
+        <w:rPr/>
+      </w:pPr>
+      <w:r>
+        <w:rPr>
+          <w:rtl w:val="0"/>
+        </w:rPr>
+        <w:t xml:space="preserve">Centralizar joins complexos</w:t>
+      </w:r>
+    </w:p>
+    <w:p>
+      <w:pPr>
+        <w:numPr>
+          <w:ilvl w:val="0"/>
+          <w:numId w:val="11"/>
+        </w:numPr>
+        <w:spacing w:after="0" w:afterAutospacing="0" w:lineRule="auto"/>
+        <w:ind w:left="720" w:hanging="360"/>
+        <w:rPr/>
+      </w:pPr>
+      <w:r>
+        <w:rPr>
+          <w:rtl w:val="0"/>
+        </w:rPr>
+        <w:t xml:space="preserve">Facilitar aplicação de escopo por nível de acesso</w:t>
+      </w:r>
+    </w:p>
+    <w:p>
+      <w:pPr>
+        <w:numPr>
+          <w:ilvl w:val="0"/>
+          <w:numId w:val="11"/>
+        </w:numPr>
+        <w:spacing w:after="240" w:lineRule="auto"/>
+        <w:ind w:left="720" w:hanging="360"/>
+        <w:rPr/>
+      </w:pPr>
+      <w:r>
+        <w:rPr>
+          <w:rtl w:val="0"/>
+        </w:rPr>
+        <w:t xml:space="preserve">Evitar exposição direta das tabelas base</w:t>
+      </w:r>
+    </w:p>
+    <w:p>
+      <w:pPr>
+        <w:spacing w:after="240" w:before="240" w:lineRule="auto"/>
+        <w:rPr>
+          <w:b w:val="1"/>
+          <w:bCs w:val="1"/>
+        </w:rPr>
+      </w:pPr>
+      <w:r>
+        <w:rPr>
+          <w:b w:val="1"/>
+          <w:bCs w:val="1"/>
+          <w:rtl w:val="0"/>
+        </w:rPr>
+        <w:t xml:space="preserve">Exemplos de Views:</w:t>
+      </w:r>
+    </w:p>
+    <w:p>
+      <w:pPr>
+        <w:numPr>
+          <w:ilvl w:val="0"/>
+          <w:numId w:val="42"/>
+        </w:numPr>
+        <w:spacing w:after="0" w:afterAutospacing="0" w:lineRule="auto"/>
+        <w:ind w:left="720" w:hanging="360"/>
+        <w:rPr/>
+      </w:pPr>
+      <w:r>
+        <w:rPr>
+          <w:rtl w:val="0"/>
+        </w:rPr>
+        <w:t xml:space="preserve">view_usuarios</w:t>
+      </w:r>
+    </w:p>
+    <w:p>
+      <w:pPr>
+        <w:numPr>
+          <w:ilvl w:val="0"/>
+          <w:numId w:val="42"/>
+        </w:numPr>
+        <w:spacing w:after="0" w:afterAutospacing="0" w:lineRule="auto"/>
+        <w:ind w:left="720" w:hanging="360"/>
+        <w:rPr/>
+      </w:pPr>
+      <w:r>
+        <w:rPr>
+          <w:rtl w:val="0"/>
+        </w:rPr>
+        <w:t xml:space="preserve">view_associados</w:t>
+      </w:r>
+    </w:p>
+    <w:p>
+      <w:pPr>
+        <w:numPr>
+          <w:ilvl w:val="0"/>
+          <w:numId w:val="42"/>
+        </w:numPr>
+        <w:spacing w:after="0" w:afterAutospacing="0" w:lineRule="auto"/>
+        <w:ind w:left="720" w:hanging="360"/>
+        <w:rPr/>
+      </w:pPr>
+      <w:r>
+        <w:rPr>
+          <w:rtl w:val="0"/>
+        </w:rPr>
+        <w:t xml:space="preserve">view_pessoas</w:t>
+      </w:r>
+    </w:p>
+    <w:p>
+      <w:pPr>
+        <w:numPr>
+          <w:ilvl w:val="0"/>
+          <w:numId w:val="42"/>
+        </w:numPr>
+        <w:spacing w:after="240" w:lineRule="auto"/>
+        <w:ind w:left="720" w:hanging="360"/>
+        <w:rPr/>
+      </w:pPr>
+      <w:r>
+        <w:rPr>
+          <w:rtl w:val="0"/>
+        </w:rPr>
+        <w:t xml:space="preserve">view_movimentacoes</w:t>
+      </w:r>
+    </w:p>
+    <w:p>
+      <w:pPr>
+        <w:spacing w:after="240" w:before="240" w:lineRule="auto"/>
+        <w:rPr/>
+      </w:pPr>
+      <w:r>
+        <w:rPr>
+          <w:rtl w:val="0"/>
+        </w:rPr>
+        <w:t xml:space="preserve">As views são utilizadas exclusivamente para operações de </w:t>
+      </w:r>
+      <w:r>
+        <w:rPr>
+          <w:b w:val="1"/>
+          <w:bCs w:val="1"/>
+          <w:rtl w:val="0"/>
+        </w:rPr>
+        <w:t xml:space="preserve">leitura</w:t>
+      </w:r>
+      <w:r>
+        <w:rPr>
+          <w:rtl w:val="0"/>
+        </w:rPr>
+        <w:t xml:space="preserve">, enquanto operações de escrita são realizadas diretamente nas tabelas.</w:t>
+      </w:r>
+    </w:p>
+    <w:p>
+      <w:pPr>
+        <w:spacing w:after="240" w:before="240" w:lineRule="auto"/>
+        <w:rPr/>
+      </w:pPr>
+      <w:r>
+        <w:rPr>
+          <w:rtl w:val="0"/>
+        </w:rPr>
+      </w:r>
+    </w:p>
+    <w:p>
+      <w:pPr>
+        <w:spacing w:after="240" w:before="240" w:lineRule="auto"/>
+        <w:rPr/>
+      </w:pPr>
+      <w:r>
+        <w:rPr>
+          <w:rtl w:val="0"/>
+        </w:rPr>
+      </w:r>
+    </w:p>
+    <w:p>
+      <w:pPr>
+        <w:spacing w:after="240" w:before="240" w:lineRule="auto"/>
+        <w:rPr/>
+      </w:pPr>
+      <w:r>
+        <w:rPr>
+          <w:rtl w:val="0"/>
+        </w:rPr>
+      </w:r>
+    </w:p>
+    <w:p>
+      <w:pPr>
+        <w:pStyle w:val="Heading3"/>
+        <w:spacing w:after="240" w:before="240" w:lineRule="auto"/>
         <w:rPr>
           <w:b w:val="1"/>
           <w:bCs w:val="1"/>
           <w:color w:val="000000"/>
-          <w:rtl w:val="0"/>
-        </w:rPr>
-        <w:t xml:space="preserve">7.5 Uso de Views</w:t>
-      </w:r>
-    </w:p>
-    <w:p>
-      <w:pPr>
-        <w:spacing w:after="240" w:before="240" w:lineRule="auto"/>
-        <w:rPr/>
-      </w:pPr>
-      <w:r>
-        <w:rPr>
-          <w:rtl w:val="0"/>
-        </w:rPr>
-        <w:t xml:space="preserve">O sistema utiliza </w:t>
-      </w:r>
-      <w:r>
-        <w:rPr>
-          <w:b w:val="1"/>
-          <w:bCs w:val="1"/>
-          <w:rtl w:val="0"/>
-        </w:rPr>
-        <w:t xml:space="preserve">views SQL</w:t>
-      </w:r>
-      <w:r>
-        <w:rPr>
-          <w:rtl w:val="0"/>
-        </w:rPr>
-        <w:t xml:space="preserve"> como camada de abstração para consultas.</w:t>
-      </w:r>
-    </w:p>
-    <w:p>
-      <w:pPr>
-        <w:spacing w:after="240" w:before="240" w:lineRule="auto"/>
-        <w:rPr>
-          <w:b w:val="1"/>
-          <w:bCs w:val="1"/>
-        </w:rPr>
-      </w:pPr>
-      <w:r>
-        <w:rPr>
-          <w:b w:val="1"/>
-          <w:bCs w:val="1"/>
-          <w:rtl w:val="0"/>
-        </w:rPr>
-        <w:t xml:space="preserve">Objetivos do uso de Views:</w:t>
-      </w:r>
-    </w:p>
-    <w:p>
-      <w:pPr>
-        <w:numPr>
-          <w:ilvl w:val="0"/>
-          <w:numId w:val="11"/>
+        </w:rPr>
+      </w:pPr>
+      <w:bookmarkStart w:colFirst="0" w:colLast="0" w:name="_ly9oiu8gdh6v" w:id="39"/>
+      <w:bookmarkEnd w:id="39"/>
+      <w:r>
+        <w:rPr>
+          <w:b w:val="1"/>
+          <w:bCs w:val="1"/>
+          <w:color w:val="000000"/>
+          <w:rtl w:val="0"/>
+        </w:rPr>
+        <w:t xml:space="preserve">7.6 Integridade e Consistência dos Dados</w:t>
+      </w:r>
+    </w:p>
+    <w:p>
+      <w:pPr>
+        <w:spacing w:after="240" w:before="240" w:lineRule="auto"/>
+        <w:rPr/>
+      </w:pPr>
+      <w:r>
+        <w:rPr>
+          <w:rtl w:val="0"/>
+        </w:rPr>
+        <w:t xml:space="preserve">O banco de dados implementa diversas estratégias para garantir a consistência:</w:t>
+      </w:r>
+    </w:p>
+    <w:p>
+      <w:pPr>
+        <w:numPr>
+          <w:ilvl w:val="0"/>
+          <w:numId w:val="32"/>
         </w:numPr>
         <w:spacing w:after="0" w:afterAutospacing="0" w:lineRule="auto"/>
         <w:ind w:left="720" w:hanging="360"/>
@@ -4279,16 +5262,18 @@
       </w:pPr>
       <w:r>
         <w:rPr>
-          <w:rtl w:val="0"/>
-        </w:rPr>
-        <w:t xml:space="preserve">Melhorar a legibilidade das consultas</w:t>
-      </w:r>
-    </w:p>
-    <w:p>
-      <w:pPr>
-        <w:numPr>
-          <w:ilvl w:val="0"/>
-          <w:numId w:val="11"/>
+          <w:b w:val="1"/>
+          <w:bCs w:val="1"/>
+          <w:rtl w:val="0"/>
+        </w:rPr>
+        <w:t xml:space="preserve">Chaves primárias e estrangeiras</w:t>
+      </w:r>
+    </w:p>
+    <w:p>
+      <w:pPr>
+        <w:numPr>
+          <w:ilvl w:val="0"/>
+          <w:numId w:val="32"/>
         </w:numPr>
         <w:spacing w:after="0" w:afterAutospacing="0" w:lineRule="auto"/>
         <w:ind w:left="720" w:hanging="360"/>
@@ -4296,16 +5281,24 @@
       </w:pPr>
       <w:r>
         <w:rPr>
-          <w:rtl w:val="0"/>
-        </w:rPr>
-        <w:t xml:space="preserve">Centralizar joins complexos</w:t>
-      </w:r>
-    </w:p>
-    <w:p>
-      <w:pPr>
-        <w:numPr>
-          <w:ilvl w:val="0"/>
-          <w:numId w:val="11"/>
+          <w:b w:val="1"/>
+          <w:bCs w:val="1"/>
+          <w:rtl w:val="0"/>
+        </w:rPr>
+        <w:t xml:space="preserve">Restrições de unicidade</w:t>
+      </w:r>
+      <w:r>
+        <w:rPr>
+          <w:rtl w:val="0"/>
+        </w:rPr>
+        <w:t xml:space="preserve"> (ex.: CAF, LOGIN)</w:t>
+      </w:r>
+    </w:p>
+    <w:p>
+      <w:pPr>
+        <w:numPr>
+          <w:ilvl w:val="0"/>
+          <w:numId w:val="32"/>
         </w:numPr>
         <w:spacing w:after="0" w:afterAutospacing="0" w:lineRule="auto"/>
         <w:ind w:left="720" w:hanging="360"/>
@@ -4313,16 +5306,24 @@
       </w:pPr>
       <w:r>
         <w:rPr>
-          <w:rtl w:val="0"/>
-        </w:rPr>
-        <w:t xml:space="preserve">Facilitar aplicação de escopo por nível de acesso</w:t>
-      </w:r>
-    </w:p>
-    <w:p>
-      <w:pPr>
-        <w:numPr>
-          <w:ilvl w:val="0"/>
-          <w:numId w:val="11"/>
+          <w:b w:val="1"/>
+          <w:bCs w:val="1"/>
+          <w:rtl w:val="0"/>
+        </w:rPr>
+        <w:t xml:space="preserve">Validação de existência de registros</w:t>
+      </w:r>
+      <w:r>
+        <w:rPr>
+          <w:rtl w:val="0"/>
+        </w:rPr>
+        <w:t xml:space="preserve"> antes de operações de escrita</w:t>
+      </w:r>
+    </w:p>
+    <w:p>
+      <w:pPr>
+        <w:numPr>
+          <w:ilvl w:val="0"/>
+          <w:numId w:val="32"/>
         </w:numPr>
         <w:spacing w:after="240" w:lineRule="auto"/>
         <w:ind w:left="720" w:hanging="360"/>
@@ -4330,33 +5331,69 @@
       </w:pPr>
       <w:r>
         <w:rPr>
-          <w:rtl w:val="0"/>
-        </w:rPr>
-        <w:t xml:space="preserve">Evitar exposição direta das tabelas base</w:t>
-      </w:r>
-    </w:p>
-    <w:p>
-      <w:pPr>
-        <w:spacing w:after="240" w:before="240" w:lineRule="auto"/>
-        <w:rPr>
-          <w:b w:val="1"/>
-          <w:bCs w:val="1"/>
-        </w:rPr>
-      </w:pPr>
-      <w:r>
-        <w:rPr>
-          <w:b w:val="1"/>
-          <w:bCs w:val="1"/>
-          <w:rtl w:val="0"/>
-        </w:rPr>
-        <w:t xml:space="preserve">Exemplos de Views:</w:t>
-      </w:r>
-    </w:p>
-    <w:p>
-      <w:pPr>
-        <w:numPr>
-          <w:ilvl w:val="0"/>
-          <w:numId w:val="40"/>
+          <w:b w:val="1"/>
+          <w:bCs w:val="1"/>
+          <w:rtl w:val="0"/>
+        </w:rPr>
+        <w:t xml:space="preserve">Validação lógica na camada de serviço</w:t>
+      </w:r>
+      <w:r>
+        <w:rPr>
+          <w:rtl w:val="0"/>
+        </w:rPr>
+        <w:t xml:space="preserve">, evitando inconsistências transacionais</w:t>
+      </w:r>
+    </w:p>
+    <w:p>
+      <w:pPr>
+        <w:spacing w:after="240" w:lineRule="auto"/>
+        <w:rPr/>
+      </w:pPr>
+      <w:r>
+        <w:rPr>
+          <w:rtl w:val="0"/>
+        </w:rPr>
+      </w:r>
+    </w:p>
+    <w:p>
+      <w:pPr>
+        <w:pStyle w:val="Heading3"/>
+        <w:spacing w:after="240" w:before="240" w:lineRule="auto"/>
+        <w:rPr>
+          <w:b w:val="1"/>
+          <w:bCs w:val="1"/>
+          <w:color w:val="000000"/>
+        </w:rPr>
+      </w:pPr>
+      <w:bookmarkStart w:colFirst="0" w:colLast="0" w:name="_rqxxdznew960" w:id="40"/>
+      <w:bookmarkEnd w:id="40"/>
+      <w:r>
+        <w:rPr>
+          <w:b w:val="1"/>
+          <w:bCs w:val="1"/>
+          <w:color w:val="000000"/>
+          <w:rtl w:val="0"/>
+        </w:rPr>
+        <w:t xml:space="preserve">7.7 Considerações sobre Escalabilidade e Manutenção</w:t>
+      </w:r>
+    </w:p>
+    <w:p>
+      <w:pPr>
+        <w:spacing w:after="240" w:before="240" w:lineRule="auto"/>
+        <w:rPr/>
+      </w:pPr>
+      <w:r>
+        <w:rPr>
+          <w:rtl w:val="0"/>
+        </w:rPr>
+        <w:t xml:space="preserve">A separação entre tabelas e views, aliada ao uso do Knex.js como camada de acesso, facilita:</w:t>
+      </w:r>
+    </w:p>
+    <w:p>
+      <w:pPr>
+        <w:numPr>
+          <w:ilvl w:val="0"/>
+          <w:numId w:val="17"/>
         </w:numPr>
         <w:spacing w:after="0" w:afterAutospacing="0" w:lineRule="auto"/>
         <w:ind w:left="720" w:hanging="360"/>
@@ -4366,14 +5403,470 @@
         <w:rPr>
           <w:rtl w:val="0"/>
         </w:rPr>
+        <w:t xml:space="preserve">Evolução do esquema sem impacto direto na API</w:t>
+      </w:r>
+    </w:p>
+    <w:p>
+      <w:pPr>
+        <w:numPr>
+          <w:ilvl w:val="0"/>
+          <w:numId w:val="17"/>
+        </w:numPr>
+        <w:spacing w:after="0" w:afterAutospacing="0" w:lineRule="auto"/>
+        <w:ind w:left="720" w:hanging="360"/>
+        <w:rPr/>
+      </w:pPr>
+      <w:r>
+        <w:rPr>
+          <w:rtl w:val="0"/>
+        </w:rPr>
+        <w:t xml:space="preserve">Refatoração de consultas complexas</w:t>
+      </w:r>
+    </w:p>
+    <w:p>
+      <w:pPr>
+        <w:numPr>
+          <w:ilvl w:val="0"/>
+          <w:numId w:val="17"/>
+        </w:numPr>
+        <w:spacing w:after="240" w:lineRule="auto"/>
+        <w:ind w:left="720" w:hanging="360"/>
+        <w:rPr/>
+      </w:pPr>
+      <w:r>
+        <w:rPr>
+          <w:rtl w:val="0"/>
+        </w:rPr>
+        <w:t xml:space="preserve">Portabilidade para outros bancos relacionais</w:t>
+      </w:r>
+    </w:p>
+    <w:p>
+      <w:pPr>
+        <w:spacing w:after="240" w:lineRule="auto"/>
+        <w:rPr/>
+      </w:pPr>
+      <w:r>
+        <w:rPr>
+          <w:rtl w:val="0"/>
+        </w:rPr>
+      </w:r>
+    </w:p>
+    <w:p>
+      <w:pPr>
+        <w:pStyle w:val="Heading3"/>
+        <w:spacing w:after="240" w:before="240" w:lineRule="auto"/>
+        <w:rPr>
+          <w:b w:val="1"/>
+          <w:bCs w:val="1"/>
+          <w:color w:val="000000"/>
+        </w:rPr>
+      </w:pPr>
+      <w:bookmarkStart w:colFirst="0" w:colLast="0" w:name="_9p1lnz6hpfap" w:id="41"/>
+      <w:bookmarkEnd w:id="41"/>
+      <w:r>
+        <w:rPr>
+          <w:b w:val="1"/>
+          <w:bCs w:val="1"/>
+          <w:color w:val="000000"/>
+          <w:rtl w:val="0"/>
+        </w:rPr>
+        <w:t xml:space="preserve">7.8 Síntese da Camada de Persistência</w:t>
+      </w:r>
+    </w:p>
+    <w:p>
+      <w:pPr>
+        <w:spacing w:after="240" w:before="240" w:lineRule="auto"/>
+        <w:rPr/>
+      </w:pPr>
+      <w:r>
+        <w:rPr>
+          <w:rtl w:val="0"/>
+        </w:rPr>
+        <w:t xml:space="preserve">A camada de banco de dados do sistema </w:t>
+      </w:r>
+      <w:r>
+        <w:rPr>
+          <w:b w:val="1"/>
+          <w:bCs w:val="1"/>
+          <w:rtl w:val="0"/>
+        </w:rPr>
+        <w:t xml:space="preserve">Agro Família Pesca</w:t>
+      </w:r>
+      <w:r>
+        <w:rPr>
+          <w:rtl w:val="0"/>
+        </w:rPr>
+        <w:t xml:space="preserve"> foi projetada para suportar crescimento, segurança e clareza semântica, alinhando-se às boas práticas de engenharia de software e modelagem relacional.</w:t>
+      </w:r>
+    </w:p>
+    <w:p>
+      <w:pPr>
+        <w:spacing w:after="240" w:before="240" w:lineRule="auto"/>
+        <w:rPr/>
+      </w:pPr>
+      <w:r>
+        <w:rPr>
+          <w:rtl w:val="0"/>
+        </w:rPr>
+      </w:r>
+    </w:p>
+    <w:p>
+      <w:pPr>
+        <w:pStyle w:val="Heading3"/>
+        <w:spacing w:after="240" w:before="240" w:lineRule="auto"/>
+        <w:rPr>
+          <w:b w:val="1"/>
+          <w:bCs w:val="1"/>
+          <w:color w:val="000000"/>
+        </w:rPr>
+      </w:pPr>
+      <w:bookmarkStart w:colFirst="0" w:colLast="0" w:name="_rf3jjph6bls5" w:id="42"/>
+      <w:bookmarkEnd w:id="42"/>
+      <w:r>
+        <w:rPr>
+          <w:b w:val="1"/>
+          <w:bCs w:val="1"/>
+          <w:color w:val="000000"/>
+          <w:rtl w:val="0"/>
+        </w:rPr>
+        <w:t xml:space="preserve">7.9 Vinculação entre Banco de Dados e Módulos da API</w:t>
+      </w:r>
+    </w:p>
+    <w:p>
+      <w:pPr>
+        <w:spacing w:after="240" w:before="240" w:lineRule="auto"/>
+        <w:rPr/>
+      </w:pPr>
+      <w:r>
+        <w:rPr>
+          <w:rtl w:val="0"/>
+        </w:rPr>
+        <w:t xml:space="preserve">O banco de dados do sistema </w:t>
+      </w:r>
+      <w:r>
+        <w:rPr>
+          <w:b w:val="1"/>
+          <w:bCs w:val="1"/>
+          <w:rtl w:val="0"/>
+        </w:rPr>
+        <w:t xml:space="preserve">Agro Família Pesca</w:t>
+      </w:r>
+      <w:r>
+        <w:rPr>
+          <w:rtl w:val="0"/>
+        </w:rPr>
+        <w:t xml:space="preserve"> está diretamente acoplado à arquitetura modular da API, onde cada </w:t>
+      </w:r>
+      <w:r>
+        <w:rPr>
+          <w:b w:val="1"/>
+          <w:bCs w:val="1"/>
+          <w:rtl w:val="0"/>
+        </w:rPr>
+        <w:t xml:space="preserve">módulo funcional</w:t>
+      </w:r>
+      <w:r>
+        <w:rPr>
+          <w:rtl w:val="0"/>
+        </w:rPr>
+        <w:t xml:space="preserve"> corresponde a um conjunto bem definido de </w:t>
+      </w:r>
+      <w:r>
+        <w:rPr>
+          <w:b w:val="1"/>
+          <w:bCs w:val="1"/>
+          <w:rtl w:val="0"/>
+        </w:rPr>
+        <w:t xml:space="preserve">tabelas e views</w:t>
+      </w:r>
+      <w:r>
+        <w:rPr>
+          <w:rtl w:val="0"/>
+        </w:rPr>
+        <w:t xml:space="preserve">, respeitando o princípio de </w:t>
+      </w:r>
+      <w:r>
+        <w:rPr>
+          <w:b w:val="1"/>
+          <w:bCs w:val="1"/>
+          <w:rtl w:val="0"/>
+        </w:rPr>
+        <w:t xml:space="preserve">responsabilidade única</w:t>
+      </w:r>
+      <w:r>
+        <w:rPr>
+          <w:rtl w:val="0"/>
+        </w:rPr>
+        <w:t xml:space="preserve">.</w:t>
+      </w:r>
+    </w:p>
+    <w:p>
+      <w:pPr>
+        <w:spacing w:after="240" w:before="240" w:lineRule="auto"/>
+        <w:rPr/>
+      </w:pPr>
+      <w:r>
+        <w:rPr>
+          <w:rtl w:val="0"/>
+        </w:rPr>
+        <w:t xml:space="preserve">Essa vinculação garante:</w:t>
+      </w:r>
+    </w:p>
+    <w:p>
+      <w:pPr>
+        <w:numPr>
+          <w:ilvl w:val="0"/>
+          <w:numId w:val="15"/>
+        </w:numPr>
+        <w:spacing w:after="0" w:afterAutospacing="0" w:lineRule="auto"/>
+        <w:ind w:left="720" w:hanging="360"/>
+        <w:rPr/>
+      </w:pPr>
+      <w:r>
+        <w:rPr>
+          <w:rtl w:val="0"/>
+        </w:rPr>
+        <w:t xml:space="preserve">Clareza na manutenção</w:t>
+      </w:r>
+    </w:p>
+    <w:p>
+      <w:pPr>
+        <w:numPr>
+          <w:ilvl w:val="0"/>
+          <w:numId w:val="15"/>
+        </w:numPr>
+        <w:spacing w:after="0" w:afterAutospacing="0" w:lineRule="auto"/>
+        <w:ind w:left="720" w:hanging="360"/>
+        <w:rPr/>
+      </w:pPr>
+      <w:r>
+        <w:rPr>
+          <w:rtl w:val="0"/>
+        </w:rPr>
+        <w:t xml:space="preserve">Facilidade de rastreabilidade entre regra de negócio e persistência</w:t>
+      </w:r>
+    </w:p>
+    <w:p>
+      <w:pPr>
+        <w:numPr>
+          <w:ilvl w:val="0"/>
+          <w:numId w:val="15"/>
+        </w:numPr>
+        <w:spacing w:after="240" w:lineRule="auto"/>
+        <w:ind w:left="720" w:hanging="360"/>
+        <w:rPr/>
+      </w:pPr>
+      <w:r>
+        <w:rPr>
+          <w:rtl w:val="0"/>
+        </w:rPr>
+        <w:t xml:space="preserve">Segurança no controle de acesso por escopo</w:t>
+      </w:r>
+    </w:p>
+    <w:p>
+      <w:pPr>
+        <w:pStyle w:val="Heading3"/>
+        <w:spacing w:after="240" w:before="240" w:lineRule="auto"/>
+        <w:rPr>
+          <w:b w:val="1"/>
+          <w:bCs w:val="1"/>
+          <w:color w:val="000000"/>
+        </w:rPr>
+      </w:pPr>
+      <w:bookmarkStart w:colFirst="0" w:colLast="0" w:name="_nis5484y9o1h" w:id="43"/>
+      <w:bookmarkEnd w:id="43"/>
+      <w:r>
+        <w:rPr>
+          <w:rFonts w:ascii="Arial Unicode MS" w:cs="Arial Unicode MS" w:eastAsia="Arial Unicode MS" w:hAnsi="Arial Unicode MS"/>
+          <w:b w:val="1"/>
+          <w:bCs w:val="1"/>
+          <w:color w:val="000000"/>
+          <w:rtl w:val="0"/>
+        </w:rPr>
+        <w:t xml:space="preserve">7.9.1 Mapeamento Módulo ↔ Entidades</w:t>
+      </w:r>
+    </w:p>
+    <w:p>
+      <w:pPr>
+        <w:pStyle w:val="Heading4"/>
+        <w:spacing w:after="240" w:before="240" w:lineRule="auto"/>
+        <w:rPr>
+          <w:b w:val="1"/>
+          <w:bCs w:val="1"/>
+          <w:color w:val="000000"/>
+        </w:rPr>
+      </w:pPr>
+      <w:bookmarkStart w:colFirst="0" w:colLast="0" w:name="_6er8njkstxa7" w:id="44"/>
+      <w:bookmarkEnd w:id="44"/>
+      <w:r>
+        <w:rPr>
+          <w:b w:val="1"/>
+          <w:bCs w:val="1"/>
+          <w:color w:val="000000"/>
+          <w:rtl w:val="0"/>
+        </w:rPr>
+        <w:t xml:space="preserve">7.9.1.1 Módulo Usuários</w:t>
+      </w:r>
+    </w:p>
+    <w:p>
+      <w:pPr>
+        <w:spacing w:after="240" w:before="240" w:lineRule="auto"/>
+        <w:rPr/>
+      </w:pPr>
+      <w:r>
+        <w:rPr>
+          <w:rtl w:val="0"/>
+        </w:rPr>
+        <w:t xml:space="preserve">Responsável pela autenticação, autorização e controle de acesso.</w:t>
+      </w:r>
+    </w:p>
+    <w:p>
+      <w:pPr>
+        <w:spacing w:after="240" w:before="240" w:lineRule="auto"/>
+        <w:rPr>
+          <w:b w:val="1"/>
+          <w:bCs w:val="1"/>
+        </w:rPr>
+      </w:pPr>
+      <w:r>
+        <w:rPr>
+          <w:rtl w:val="0"/>
+        </w:rPr>
+      </w:r>
+    </w:p>
+    <w:p>
+      <w:pPr>
+        <w:spacing w:after="240" w:before="240" w:lineRule="auto"/>
+        <w:rPr/>
+      </w:pPr>
+      <w:r>
+        <w:rPr>
+          <w:b w:val="1"/>
+          <w:bCs w:val="1"/>
+          <w:rtl w:val="0"/>
+        </w:rPr>
+        <w:t xml:space="preserve">Tabelas</w:t>
+      </w:r>
+      <w:r>
+        <w:rPr>
+          <w:rtl w:val="0"/>
+        </w:rPr>
+        <w:t xml:space="preserve">:</w:t>
+      </w:r>
+    </w:p>
+    <w:p>
+      <w:pPr>
+        <w:numPr>
+          <w:ilvl w:val="0"/>
+          <w:numId w:val="20"/>
+        </w:numPr>
+        <w:spacing w:after="0" w:afterAutospacing="0" w:lineRule="auto"/>
+        <w:ind w:left="720" w:hanging="360"/>
+        <w:rPr/>
+      </w:pPr>
+      <w:r>
+        <w:rPr>
+          <w:rtl w:val="0"/>
+        </w:rPr>
+        <w:t xml:space="preserve">usuario</w:t>
+      </w:r>
+    </w:p>
+    <w:p>
+      <w:pPr>
+        <w:numPr>
+          <w:ilvl w:val="0"/>
+          <w:numId w:val="20"/>
+        </w:numPr>
+        <w:spacing w:after="0" w:afterAutospacing="0" w:lineRule="auto"/>
+        <w:ind w:left="720" w:hanging="360"/>
+        <w:rPr/>
+      </w:pPr>
+      <w:r>
+        <w:rPr>
+          <w:rtl w:val="0"/>
+        </w:rPr>
+        <w:t xml:space="preserve">pessoa</w:t>
+      </w:r>
+    </w:p>
+    <w:p>
+      <w:pPr>
+        <w:numPr>
+          <w:ilvl w:val="0"/>
+          <w:numId w:val="20"/>
+        </w:numPr>
+        <w:spacing w:after="240" w:lineRule="auto"/>
+        <w:ind w:left="720" w:hanging="360"/>
+        <w:rPr/>
+      </w:pPr>
+      <w:r>
+        <w:rPr>
+          <w:rtl w:val="0"/>
+        </w:rPr>
+        <w:t xml:space="preserve">secretaria</w:t>
+      </w:r>
+    </w:p>
+    <w:p>
+      <w:pPr>
+        <w:spacing w:after="240" w:before="240" w:lineRule="auto"/>
+        <w:rPr/>
+      </w:pPr>
+      <w:r>
+        <w:rPr>
+          <w:b w:val="1"/>
+          <w:bCs w:val="1"/>
+          <w:rtl w:val="0"/>
+        </w:rPr>
+        <w:t xml:space="preserve">Views</w:t>
+      </w:r>
+      <w:r>
+        <w:rPr>
+          <w:rtl w:val="0"/>
+        </w:rPr>
+        <w:t xml:space="preserve">:</w:t>
+      </w:r>
+    </w:p>
+    <w:p>
+      <w:pPr>
+        <w:numPr>
+          <w:ilvl w:val="0"/>
+          <w:numId w:val="29"/>
+        </w:numPr>
+        <w:spacing w:after="240" w:lineRule="auto"/>
+        <w:ind w:left="720" w:hanging="360"/>
+        <w:rPr/>
+      </w:pPr>
+      <w:r>
+        <w:rPr>
+          <w:rtl w:val="0"/>
+        </w:rPr>
         <w:t xml:space="preserve">view_usuarios</w:t>
       </w:r>
     </w:p>
     <w:p>
       <w:pPr>
-        <w:numPr>
-          <w:ilvl w:val="0"/>
-          <w:numId w:val="40"/>
+        <w:spacing w:after="240" w:before="240" w:lineRule="auto"/>
+        <w:rPr/>
+      </w:pPr>
+      <w:r>
+        <w:rPr>
+          <w:b w:val="1"/>
+          <w:bCs w:val="1"/>
+          <w:rtl w:val="0"/>
+        </w:rPr>
+        <w:t xml:space="preserve">Relacionamentos-chave</w:t>
+      </w:r>
+      <w:r>
+        <w:rPr>
+          <w:rtl w:val="0"/>
+        </w:rPr>
+        <w:t xml:space="preserve">:</w:t>
+      </w:r>
+    </w:p>
+    <w:p>
+      <w:pPr>
+        <w:numPr>
+          <w:ilvl w:val="0"/>
+          <w:numId w:val="39"/>
         </w:numPr>
         <w:spacing w:after="0" w:afterAutospacing="0" w:lineRule="auto"/>
         <w:ind w:left="720" w:hanging="360"/>
@@ -4381,33 +5874,17 @@
       </w:pPr>
       <w:r>
         <w:rPr>
-          <w:rtl w:val="0"/>
-        </w:rPr>
-        <w:t xml:space="preserve">view_associados</w:t>
-      </w:r>
-    </w:p>
-    <w:p>
-      <w:pPr>
-        <w:numPr>
-          <w:ilvl w:val="0"/>
-          <w:numId w:val="40"/>
-        </w:numPr>
-        <w:spacing w:after="0" w:afterAutospacing="0" w:lineRule="auto"/>
-        <w:ind w:left="720" w:hanging="360"/>
-        <w:rPr/>
-      </w:pPr>
-      <w:r>
-        <w:rPr>
-          <w:rtl w:val="0"/>
-        </w:rPr>
-        <w:t xml:space="preserve">view_pessoas</w:t>
-      </w:r>
-    </w:p>
-    <w:p>
-      <w:pPr>
-        <w:numPr>
-          <w:ilvl w:val="0"/>
-          <w:numId w:val="40"/>
+          <w:rFonts w:ascii="Arial Unicode MS" w:cs="Arial Unicode MS" w:eastAsia="Arial Unicode MS" w:hAnsi="Arial Unicode MS"/>
+          <w:rtl w:val="0"/>
+        </w:rPr>
+        <w:t xml:space="preserve">usuario.ID_PESSOA → pessoa.ID</w:t>
+      </w:r>
+    </w:p>
+    <w:p>
+      <w:pPr>
+        <w:numPr>
+          <w:ilvl w:val="0"/>
+          <w:numId w:val="39"/>
         </w:numPr>
         <w:spacing w:after="240" w:lineRule="auto"/>
         <w:ind w:left="720" w:hanging="360"/>
@@ -4415,73 +5892,37 @@
       </w:pPr>
       <w:r>
         <w:rPr>
-          <w:rtl w:val="0"/>
-        </w:rPr>
-        <w:t xml:space="preserve">view_movimentacoes</w:t>
-      </w:r>
-    </w:p>
-    <w:p>
-      <w:pPr>
-        <w:spacing w:after="240" w:before="240" w:lineRule="auto"/>
-        <w:rPr/>
-      </w:pPr>
-      <w:r>
-        <w:rPr>
-          <w:rtl w:val="0"/>
-        </w:rPr>
-        <w:t xml:space="preserve">As views são utilizadas exclusivamente para operações de </w:t>
-      </w:r>
-      <w:r>
-        <w:rPr>
-          <w:b w:val="1"/>
-          <w:bCs w:val="1"/>
-          <w:rtl w:val="0"/>
-        </w:rPr>
-        <w:t xml:space="preserve">leitura</w:t>
-      </w:r>
-      <w:r>
-        <w:rPr>
-          <w:rtl w:val="0"/>
-        </w:rPr>
-        <w:t xml:space="preserve">, enquanto operações de escrita são realizadas diretamente nas tabelas.</w:t>
-      </w:r>
-    </w:p>
-    <w:p>
-      <w:pPr>
-        <w:spacing w:after="240" w:before="240" w:lineRule="auto"/>
-        <w:rPr/>
-      </w:pPr>
-      <w:r>
-        <w:rPr>
-          <w:rtl w:val="0"/>
-        </w:rPr>
-      </w:r>
-    </w:p>
-    <w:p>
-      <w:pPr>
-        <w:spacing w:after="240" w:before="240" w:lineRule="auto"/>
-        <w:rPr/>
-      </w:pPr>
-      <w:r>
-        <w:rPr>
-          <w:rtl w:val="0"/>
-        </w:rPr>
-      </w:r>
-    </w:p>
-    <w:p>
-      <w:pPr>
-        <w:spacing w:after="240" w:before="240" w:lineRule="auto"/>
-        <w:rPr/>
-      </w:pPr>
-      <w:r>
-        <w:rPr>
-          <w:rtl w:val="0"/>
-        </w:rPr>
-      </w:r>
-    </w:p>
-    <w:p>
-      <w:pPr>
-        <w:pStyle w:val="Heading3"/>
+          <w:rFonts w:ascii="Arial Unicode MS" w:cs="Arial Unicode MS" w:eastAsia="Arial Unicode MS" w:hAnsi="Arial Unicode MS"/>
+          <w:rtl w:val="0"/>
+        </w:rPr>
+        <w:t xml:space="preserve">usuario.ID_SECRETARIA → </w:t>
+      </w:r>
+      <w:r>
+        <w:rPr>
+          <w:rtl w:val="0"/>
+        </w:rPr>
+        <w:t xml:space="preserve">secretaria.ID</w:t>
+      </w:r>
+      <w:r>
+        <w:rPr>
+          <w:rtl w:val="0"/>
+        </w:rPr>
+      </w:r>
+    </w:p>
+    <w:p>
+      <w:pPr>
+        <w:spacing w:after="240" w:lineRule="auto"/>
+        <w:rPr/>
+      </w:pPr>
+      <w:r>
+        <w:rPr>
+          <w:rtl w:val="0"/>
+        </w:rPr>
+      </w:r>
+    </w:p>
+    <w:p>
+      <w:pPr>
+        <w:pStyle w:val="Heading4"/>
         <w:spacing w:after="240" w:before="240" w:lineRule="auto"/>
         <w:rPr>
           <w:b w:val="1"/>
@@ -4489,712 +5930,8 @@
           <w:color w:val="000000"/>
         </w:rPr>
       </w:pPr>
-      <w:bookmarkStart w:colFirst="0" w:colLast="0" w:name="_ly9oiu8gdh6v" w:id="36"/>
-      <w:bookmarkEnd w:id="36"/>
-      <w:r>
-        <w:rPr>
-          <w:b w:val="1"/>
-          <w:bCs w:val="1"/>
-          <w:color w:val="000000"/>
-          <w:rtl w:val="0"/>
-        </w:rPr>
-        <w:t xml:space="preserve">7.6 Integridade e Consistência dos Dados</w:t>
-      </w:r>
-    </w:p>
-    <w:p>
-      <w:pPr>
-        <w:spacing w:after="240" w:before="240" w:lineRule="auto"/>
-        <w:rPr/>
-      </w:pPr>
-      <w:r>
-        <w:rPr>
-          <w:rtl w:val="0"/>
-        </w:rPr>
-        <w:t xml:space="preserve">O banco de dados implementa diversas estratégias para garantir a consistência:</w:t>
-      </w:r>
-    </w:p>
-    <w:p>
-      <w:pPr>
-        <w:numPr>
-          <w:ilvl w:val="0"/>
-          <w:numId w:val="31"/>
-        </w:numPr>
-        <w:spacing w:after="0" w:afterAutospacing="0" w:lineRule="auto"/>
-        <w:ind w:left="720" w:hanging="360"/>
-        <w:rPr/>
-      </w:pPr>
-      <w:r>
-        <w:rPr>
-          <w:b w:val="1"/>
-          <w:bCs w:val="1"/>
-          <w:rtl w:val="0"/>
-        </w:rPr>
-        <w:t xml:space="preserve">Chaves primárias e estrangeiras</w:t>
-      </w:r>
-    </w:p>
-    <w:p>
-      <w:pPr>
-        <w:numPr>
-          <w:ilvl w:val="0"/>
-          <w:numId w:val="31"/>
-        </w:numPr>
-        <w:spacing w:after="0" w:afterAutospacing="0" w:lineRule="auto"/>
-        <w:ind w:left="720" w:hanging="360"/>
-        <w:rPr/>
-      </w:pPr>
-      <w:r>
-        <w:rPr>
-          <w:b w:val="1"/>
-          <w:bCs w:val="1"/>
-          <w:rtl w:val="0"/>
-        </w:rPr>
-        <w:t xml:space="preserve">Restrições de unicidade</w:t>
-      </w:r>
-      <w:r>
-        <w:rPr>
-          <w:rtl w:val="0"/>
-        </w:rPr>
-        <w:t xml:space="preserve"> (ex.: CAF, LOGIN)</w:t>
-      </w:r>
-    </w:p>
-    <w:p>
-      <w:pPr>
-        <w:numPr>
-          <w:ilvl w:val="0"/>
-          <w:numId w:val="31"/>
-        </w:numPr>
-        <w:spacing w:after="0" w:afterAutospacing="0" w:lineRule="auto"/>
-        <w:ind w:left="720" w:hanging="360"/>
-        <w:rPr/>
-      </w:pPr>
-      <w:r>
-        <w:rPr>
-          <w:b w:val="1"/>
-          <w:bCs w:val="1"/>
-          <w:rtl w:val="0"/>
-        </w:rPr>
-        <w:t xml:space="preserve">Validação de existência de registros</w:t>
-      </w:r>
-      <w:r>
-        <w:rPr>
-          <w:rtl w:val="0"/>
-        </w:rPr>
-        <w:t xml:space="preserve"> antes de operações de escrita</w:t>
-      </w:r>
-    </w:p>
-    <w:p>
-      <w:pPr>
-        <w:numPr>
-          <w:ilvl w:val="0"/>
-          <w:numId w:val="31"/>
-        </w:numPr>
-        <w:spacing w:after="240" w:lineRule="auto"/>
-        <w:ind w:left="720" w:hanging="360"/>
-        <w:rPr/>
-      </w:pPr>
-      <w:r>
-        <w:rPr>
-          <w:b w:val="1"/>
-          <w:bCs w:val="1"/>
-          <w:rtl w:val="0"/>
-        </w:rPr>
-        <w:t xml:space="preserve">Validação lógica na camada de serviço</w:t>
-      </w:r>
-      <w:r>
-        <w:rPr>
-          <w:rtl w:val="0"/>
-        </w:rPr>
-        <w:t xml:space="preserve">, evitando inconsistências transacionais</w:t>
-      </w:r>
-    </w:p>
-    <w:p>
-      <w:pPr>
-        <w:spacing w:after="240" w:lineRule="auto"/>
-        <w:rPr/>
-      </w:pPr>
-      <w:r>
-        <w:rPr>
-          <w:rtl w:val="0"/>
-        </w:rPr>
-      </w:r>
-    </w:p>
-    <w:p>
-      <w:pPr>
-        <w:pStyle w:val="Heading3"/>
-        <w:spacing w:after="240" w:before="240" w:lineRule="auto"/>
-        <w:rPr>
-          <w:b w:val="1"/>
-          <w:bCs w:val="1"/>
-          <w:color w:val="000000"/>
-        </w:rPr>
-      </w:pPr>
-      <w:bookmarkStart w:colFirst="0" w:colLast="0" w:name="_rqxxdznew960" w:id="37"/>
-      <w:bookmarkEnd w:id="37"/>
-      <w:r>
-        <w:rPr>
-          <w:b w:val="1"/>
-          <w:bCs w:val="1"/>
-          <w:color w:val="000000"/>
-          <w:rtl w:val="0"/>
-        </w:rPr>
-        <w:t xml:space="preserve">7.7 Considerações sobre Escalabilidade e Manutenção</w:t>
-      </w:r>
-    </w:p>
-    <w:p>
-      <w:pPr>
-        <w:spacing w:after="240" w:before="240" w:lineRule="auto"/>
-        <w:rPr/>
-      </w:pPr>
-      <w:r>
-        <w:rPr>
-          <w:rtl w:val="0"/>
-        </w:rPr>
-        <w:t xml:space="preserve">A separação entre tabelas e views, aliada ao uso do Knex.js como camada de acesso, facilita:</w:t>
-      </w:r>
-    </w:p>
-    <w:p>
-      <w:pPr>
-        <w:numPr>
-          <w:ilvl w:val="0"/>
-          <w:numId w:val="17"/>
-        </w:numPr>
-        <w:spacing w:after="0" w:afterAutospacing="0" w:lineRule="auto"/>
-        <w:ind w:left="720" w:hanging="360"/>
-        <w:rPr/>
-      </w:pPr>
-      <w:r>
-        <w:rPr>
-          <w:rtl w:val="0"/>
-        </w:rPr>
-        <w:t xml:space="preserve">Evolução do esquema sem impacto direto na API</w:t>
-      </w:r>
-    </w:p>
-    <w:p>
-      <w:pPr>
-        <w:numPr>
-          <w:ilvl w:val="0"/>
-          <w:numId w:val="17"/>
-        </w:numPr>
-        <w:spacing w:after="0" w:afterAutospacing="0" w:lineRule="auto"/>
-        <w:ind w:left="720" w:hanging="360"/>
-        <w:rPr/>
-      </w:pPr>
-      <w:r>
-        <w:rPr>
-          <w:rtl w:val="0"/>
-        </w:rPr>
-        <w:t xml:space="preserve">Refatoração de consultas complexas</w:t>
-      </w:r>
-    </w:p>
-    <w:p>
-      <w:pPr>
-        <w:numPr>
-          <w:ilvl w:val="0"/>
-          <w:numId w:val="17"/>
-        </w:numPr>
-        <w:spacing w:after="240" w:lineRule="auto"/>
-        <w:ind w:left="720" w:hanging="360"/>
-        <w:rPr/>
-      </w:pPr>
-      <w:r>
-        <w:rPr>
-          <w:rtl w:val="0"/>
-        </w:rPr>
-        <w:t xml:space="preserve">Portabilidade para outros bancos relacionais</w:t>
-      </w:r>
-    </w:p>
-    <w:p>
-      <w:pPr>
-        <w:spacing w:after="240" w:lineRule="auto"/>
-        <w:rPr/>
-      </w:pPr>
-      <w:r>
-        <w:rPr>
-          <w:rtl w:val="0"/>
-        </w:rPr>
-      </w:r>
-    </w:p>
-    <w:p>
-      <w:pPr>
-        <w:pStyle w:val="Heading3"/>
-        <w:spacing w:after="240" w:before="240" w:lineRule="auto"/>
-        <w:rPr>
-          <w:b w:val="1"/>
-          <w:bCs w:val="1"/>
-          <w:color w:val="000000"/>
-        </w:rPr>
-      </w:pPr>
-      <w:bookmarkStart w:colFirst="0" w:colLast="0" w:name="_9p1lnz6hpfap" w:id="38"/>
-      <w:bookmarkEnd w:id="38"/>
-      <w:r>
-        <w:rPr>
-          <w:b w:val="1"/>
-          <w:bCs w:val="1"/>
-          <w:color w:val="000000"/>
-          <w:rtl w:val="0"/>
-        </w:rPr>
-        <w:t xml:space="preserve">7.8 Síntese da Camada de Persistência</w:t>
-      </w:r>
-    </w:p>
-    <w:p>
-      <w:pPr>
-        <w:spacing w:after="240" w:before="240" w:lineRule="auto"/>
-        <w:rPr/>
-      </w:pPr>
-      <w:r>
-        <w:rPr>
-          <w:rtl w:val="0"/>
-        </w:rPr>
-        <w:t xml:space="preserve">A camada de banco de dados do sistema </w:t>
-      </w:r>
-      <w:r>
-        <w:rPr>
-          <w:b w:val="1"/>
-          <w:bCs w:val="1"/>
-          <w:rtl w:val="0"/>
-        </w:rPr>
-        <w:t xml:space="preserve">Agro Família Pesca</w:t>
-      </w:r>
-      <w:r>
-        <w:rPr>
-          <w:rtl w:val="0"/>
-        </w:rPr>
-        <w:t xml:space="preserve"> foi projetada para suportar crescimento, segurança e clareza semântica, alinhando-se às boas práticas de engenharia de software e modelagem relacional.</w:t>
-      </w:r>
-    </w:p>
-    <w:p>
-      <w:pPr>
-        <w:spacing w:after="240" w:before="240" w:lineRule="auto"/>
-        <w:rPr/>
-      </w:pPr>
-      <w:r>
-        <w:rPr>
-          <w:rtl w:val="0"/>
-        </w:rPr>
-      </w:r>
-    </w:p>
-    <w:p>
-      <w:pPr>
-        <w:pStyle w:val="Heading3"/>
-        <w:spacing w:after="240" w:before="240" w:lineRule="auto"/>
-        <w:rPr>
-          <w:b w:val="1"/>
-          <w:bCs w:val="1"/>
-          <w:color w:val="000000"/>
-        </w:rPr>
-      </w:pPr>
-      <w:bookmarkStart w:colFirst="0" w:colLast="0" w:name="_rf3jjph6bls5" w:id="39"/>
-      <w:bookmarkEnd w:id="39"/>
-      <w:r>
-        <w:rPr>
-          <w:b w:val="1"/>
-          <w:bCs w:val="1"/>
-          <w:color w:val="000000"/>
-          <w:rtl w:val="0"/>
-        </w:rPr>
-        <w:t xml:space="preserve">7.9 Vinculação entre Banco de Dados e Módulos da API</w:t>
-      </w:r>
-    </w:p>
-    <w:p>
-      <w:pPr>
-        <w:spacing w:after="240" w:before="240" w:lineRule="auto"/>
-        <w:rPr/>
-      </w:pPr>
-      <w:r>
-        <w:rPr>
-          <w:rtl w:val="0"/>
-        </w:rPr>
-        <w:t xml:space="preserve">O banco de dados do sistema </w:t>
-      </w:r>
-      <w:r>
-        <w:rPr>
-          <w:b w:val="1"/>
-          <w:bCs w:val="1"/>
-          <w:rtl w:val="0"/>
-        </w:rPr>
-        <w:t xml:space="preserve">Agro Família Pesca</w:t>
-      </w:r>
-      <w:r>
-        <w:rPr>
-          <w:rtl w:val="0"/>
-        </w:rPr>
-        <w:t xml:space="preserve"> está diretamente acoplado à arquitetura modular da API, onde cada </w:t>
-      </w:r>
-      <w:r>
-        <w:rPr>
-          <w:b w:val="1"/>
-          <w:bCs w:val="1"/>
-          <w:rtl w:val="0"/>
-        </w:rPr>
-        <w:t xml:space="preserve">módulo funcional</w:t>
-      </w:r>
-      <w:r>
-        <w:rPr>
-          <w:rtl w:val="0"/>
-        </w:rPr>
-        <w:t xml:space="preserve"> corresponde a um conjunto bem definido de </w:t>
-      </w:r>
-      <w:r>
-        <w:rPr>
-          <w:b w:val="1"/>
-          <w:bCs w:val="1"/>
-          <w:rtl w:val="0"/>
-        </w:rPr>
-        <w:t xml:space="preserve">tabelas e views</w:t>
-      </w:r>
-      <w:r>
-        <w:rPr>
-          <w:rtl w:val="0"/>
-        </w:rPr>
-        <w:t xml:space="preserve">, respeitando o princípio de </w:t>
-      </w:r>
-      <w:r>
-        <w:rPr>
-          <w:b w:val="1"/>
-          <w:bCs w:val="1"/>
-          <w:rtl w:val="0"/>
-        </w:rPr>
-        <w:t xml:space="preserve">responsabilidade única</w:t>
-      </w:r>
-      <w:r>
-        <w:rPr>
-          <w:rtl w:val="0"/>
-        </w:rPr>
-        <w:t xml:space="preserve">.</w:t>
-      </w:r>
-    </w:p>
-    <w:p>
-      <w:pPr>
-        <w:spacing w:after="240" w:before="240" w:lineRule="auto"/>
-        <w:rPr/>
-      </w:pPr>
-      <w:r>
-        <w:rPr>
-          <w:rtl w:val="0"/>
-        </w:rPr>
-        <w:t xml:space="preserve">Essa vinculação garante:</w:t>
-      </w:r>
-    </w:p>
-    <w:p>
-      <w:pPr>
-        <w:numPr>
-          <w:ilvl w:val="0"/>
-          <w:numId w:val="15"/>
-        </w:numPr>
-        <w:spacing w:after="0" w:afterAutospacing="0" w:lineRule="auto"/>
-        <w:ind w:left="720" w:hanging="360"/>
-        <w:rPr/>
-      </w:pPr>
-      <w:r>
-        <w:rPr>
-          <w:rtl w:val="0"/>
-        </w:rPr>
-        <w:t xml:space="preserve">Clareza na manutenção</w:t>
-      </w:r>
-    </w:p>
-    <w:p>
-      <w:pPr>
-        <w:numPr>
-          <w:ilvl w:val="0"/>
-          <w:numId w:val="15"/>
-        </w:numPr>
-        <w:spacing w:after="0" w:afterAutospacing="0" w:lineRule="auto"/>
-        <w:ind w:left="720" w:hanging="360"/>
-        <w:rPr/>
-      </w:pPr>
-      <w:r>
-        <w:rPr>
-          <w:rtl w:val="0"/>
-        </w:rPr>
-        <w:t xml:space="preserve">Facilidade de rastreabilidade entre regra de negócio e persistência</w:t>
-      </w:r>
-    </w:p>
-    <w:p>
-      <w:pPr>
-        <w:numPr>
-          <w:ilvl w:val="0"/>
-          <w:numId w:val="15"/>
-        </w:numPr>
-        <w:spacing w:after="240" w:lineRule="auto"/>
-        <w:ind w:left="720" w:hanging="360"/>
-        <w:rPr/>
-      </w:pPr>
-      <w:r>
-        <w:rPr>
-          <w:rtl w:val="0"/>
-        </w:rPr>
-        <w:t xml:space="preserve">Segurança no controle de acesso por escopo</w:t>
-      </w:r>
-    </w:p>
-    <w:p>
-      <w:pPr>
-        <w:pStyle w:val="Heading3"/>
-        <w:spacing w:after="240" w:before="240" w:lineRule="auto"/>
-        <w:rPr>
-          <w:b w:val="1"/>
-          <w:bCs w:val="1"/>
-          <w:color w:val="000000"/>
-        </w:rPr>
-      </w:pPr>
-      <w:bookmarkStart w:colFirst="0" w:colLast="0" w:name="_nis5484y9o1h" w:id="40"/>
-      <w:bookmarkEnd w:id="40"/>
-      <w:r>
-        <w:rPr>
-          <w:rFonts w:ascii="Arial Unicode MS" w:cs="Arial Unicode MS" w:eastAsia="Arial Unicode MS" w:hAnsi="Arial Unicode MS"/>
-          <w:b w:val="1"/>
-          <w:bCs w:val="1"/>
-          <w:color w:val="000000"/>
-          <w:rtl w:val="0"/>
-        </w:rPr>
-        <w:t xml:space="preserve">7.9.1 Mapeamento Módulo ↔ Entidades</w:t>
-      </w:r>
-    </w:p>
-    <w:p>
-      <w:pPr>
-        <w:pStyle w:val="Heading4"/>
-        <w:spacing w:after="240" w:before="240" w:lineRule="auto"/>
-        <w:rPr>
-          <w:b w:val="1"/>
-          <w:bCs w:val="1"/>
-          <w:color w:val="000000"/>
-        </w:rPr>
-      </w:pPr>
-      <w:bookmarkStart w:colFirst="0" w:colLast="0" w:name="_6er8njkstxa7" w:id="41"/>
-      <w:bookmarkEnd w:id="41"/>
-      <w:r>
-        <w:rPr>
-          <w:b w:val="1"/>
-          <w:bCs w:val="1"/>
-          <w:color w:val="000000"/>
-          <w:rtl w:val="0"/>
-        </w:rPr>
-        <w:t xml:space="preserve">7.9.1.1 Módulo Usuários</w:t>
-      </w:r>
-    </w:p>
-    <w:p>
-      <w:pPr>
-        <w:spacing w:after="240" w:before="240" w:lineRule="auto"/>
-        <w:rPr/>
-      </w:pPr>
-      <w:r>
-        <w:rPr>
-          <w:rtl w:val="0"/>
-        </w:rPr>
-        <w:t xml:space="preserve">Responsável pela autenticação, autorização e controle de acesso.</w:t>
-      </w:r>
-    </w:p>
-    <w:p>
-      <w:pPr>
-        <w:spacing w:after="240" w:before="240" w:lineRule="auto"/>
-        <w:rPr>
-          <w:b w:val="1"/>
-          <w:bCs w:val="1"/>
-        </w:rPr>
-      </w:pPr>
-      <w:r>
-        <w:rPr>
-          <w:rtl w:val="0"/>
-        </w:rPr>
-      </w:r>
-    </w:p>
-    <w:p>
-      <w:pPr>
-        <w:spacing w:after="240" w:before="240" w:lineRule="auto"/>
-        <w:rPr/>
-      </w:pPr>
-      <w:r>
-        <w:rPr>
-          <w:b w:val="1"/>
-          <w:bCs w:val="1"/>
-          <w:rtl w:val="0"/>
-        </w:rPr>
-        <w:t xml:space="preserve">Tabelas</w:t>
-      </w:r>
-      <w:r>
-        <w:rPr>
-          <w:rtl w:val="0"/>
-        </w:rPr>
-        <w:t xml:space="preserve">:</w:t>
-      </w:r>
-    </w:p>
-    <w:p>
-      <w:pPr>
-        <w:numPr>
-          <w:ilvl w:val="0"/>
-          <w:numId w:val="20"/>
-        </w:numPr>
-        <w:spacing w:after="0" w:afterAutospacing="0" w:lineRule="auto"/>
-        <w:ind w:left="720" w:hanging="360"/>
-        <w:rPr/>
-      </w:pPr>
-      <w:r>
-        <w:rPr>
-          <w:rtl w:val="0"/>
-        </w:rPr>
-        <w:t xml:space="preserve">usuario</w:t>
-      </w:r>
-    </w:p>
-    <w:p>
-      <w:pPr>
-        <w:numPr>
-          <w:ilvl w:val="0"/>
-          <w:numId w:val="20"/>
-        </w:numPr>
-        <w:spacing w:after="0" w:afterAutospacing="0" w:lineRule="auto"/>
-        <w:ind w:left="720" w:hanging="360"/>
-        <w:rPr/>
-      </w:pPr>
-      <w:r>
-        <w:rPr>
-          <w:rtl w:val="0"/>
-        </w:rPr>
-        <w:t xml:space="preserve">pessoa</w:t>
-      </w:r>
-    </w:p>
-    <w:p>
-      <w:pPr>
-        <w:numPr>
-          <w:ilvl w:val="0"/>
-          <w:numId w:val="20"/>
-        </w:numPr>
-        <w:spacing w:after="240" w:lineRule="auto"/>
-        <w:ind w:left="720" w:hanging="360"/>
-        <w:rPr/>
-      </w:pPr>
-      <w:r>
-        <w:rPr>
-          <w:rtl w:val="0"/>
-        </w:rPr>
-        <w:t xml:space="preserve">secretaria</w:t>
-      </w:r>
-    </w:p>
-    <w:p>
-      <w:pPr>
-        <w:spacing w:after="240" w:before="240" w:lineRule="auto"/>
-        <w:rPr/>
-      </w:pPr>
-      <w:r>
-        <w:rPr>
-          <w:b w:val="1"/>
-          <w:bCs w:val="1"/>
-          <w:rtl w:val="0"/>
-        </w:rPr>
-        <w:t xml:space="preserve">Views</w:t>
-      </w:r>
-      <w:r>
-        <w:rPr>
-          <w:rtl w:val="0"/>
-        </w:rPr>
-        <w:t xml:space="preserve">:</w:t>
-      </w:r>
-    </w:p>
-    <w:p>
-      <w:pPr>
-        <w:numPr>
-          <w:ilvl w:val="0"/>
-          <w:numId w:val="29"/>
-        </w:numPr>
-        <w:spacing w:after="240" w:lineRule="auto"/>
-        <w:ind w:left="720" w:hanging="360"/>
-        <w:rPr/>
-      </w:pPr>
-      <w:r>
-        <w:rPr>
-          <w:rtl w:val="0"/>
-        </w:rPr>
-        <w:t xml:space="preserve">view_usuarios</w:t>
-      </w:r>
-    </w:p>
-    <w:p>
-      <w:pPr>
-        <w:spacing w:after="240" w:before="240" w:lineRule="auto"/>
-        <w:rPr/>
-      </w:pPr>
-      <w:r>
-        <w:rPr>
-          <w:b w:val="1"/>
-          <w:bCs w:val="1"/>
-          <w:rtl w:val="0"/>
-        </w:rPr>
-        <w:t xml:space="preserve">Relacionamentos-chave</w:t>
-      </w:r>
-      <w:r>
-        <w:rPr>
-          <w:rtl w:val="0"/>
-        </w:rPr>
-        <w:t xml:space="preserve">:</w:t>
-      </w:r>
-    </w:p>
-    <w:p>
-      <w:pPr>
-        <w:numPr>
-          <w:ilvl w:val="0"/>
-          <w:numId w:val="37"/>
-        </w:numPr>
-        <w:spacing w:after="0" w:afterAutospacing="0" w:lineRule="auto"/>
-        <w:ind w:left="720" w:hanging="360"/>
-        <w:rPr/>
-      </w:pPr>
-      <w:r>
-        <w:rPr>
-          <w:rFonts w:ascii="Arial Unicode MS" w:cs="Arial Unicode MS" w:eastAsia="Arial Unicode MS" w:hAnsi="Arial Unicode MS"/>
-          <w:rtl w:val="0"/>
-        </w:rPr>
-        <w:t xml:space="preserve">usuario.ID_PESSOA → pessoa.ID</w:t>
-      </w:r>
-    </w:p>
-    <w:p>
-      <w:pPr>
-        <w:numPr>
-          <w:ilvl w:val="0"/>
-          <w:numId w:val="37"/>
-        </w:numPr>
-        <w:spacing w:after="240" w:lineRule="auto"/>
-        <w:ind w:left="720" w:hanging="360"/>
-        <w:rPr/>
-      </w:pPr>
-      <w:r>
-        <w:rPr>
-          <w:rFonts w:ascii="Arial Unicode MS" w:cs="Arial Unicode MS" w:eastAsia="Arial Unicode MS" w:hAnsi="Arial Unicode MS"/>
-          <w:rtl w:val="0"/>
-        </w:rPr>
-        <w:t xml:space="preserve">usuario.ID_SECRETARIA → </w:t>
-      </w:r>
-      <w:r>
-        <w:rPr>
-          <w:rtl w:val="0"/>
-        </w:rPr>
-        <w:t xml:space="preserve">secretaria.ID</w:t>
-      </w:r>
-      <w:r>
-        <w:rPr>
-          <w:rtl w:val="0"/>
-        </w:rPr>
-      </w:r>
-    </w:p>
-    <w:p>
-      <w:pPr>
-        <w:spacing w:after="240" w:lineRule="auto"/>
-        <w:rPr/>
-      </w:pPr>
-      <w:r>
-        <w:rPr>
-          <w:rtl w:val="0"/>
-        </w:rPr>
-      </w:r>
-    </w:p>
-    <w:p>
-      <w:pPr>
-        <w:pStyle w:val="Heading4"/>
-        <w:spacing w:after="240" w:before="240" w:lineRule="auto"/>
-        <w:rPr>
-          <w:b w:val="1"/>
-          <w:bCs w:val="1"/>
-          <w:color w:val="000000"/>
-        </w:rPr>
-      </w:pPr>
-      <w:bookmarkStart w:colFirst="0" w:colLast="0" w:name="_51hpzbaf31cu" w:id="42"/>
-      <w:bookmarkEnd w:id="42"/>
+      <w:bookmarkStart w:colFirst="0" w:colLast="0" w:name="_51hpzbaf31cu" w:id="45"/>
+      <w:bookmarkEnd w:id="45"/>
       <w:r>
         <w:rPr>
           <w:b w:val="1"/>
@@ -5252,7 +5989,7 @@
       <w:pPr>
         <w:numPr>
           <w:ilvl w:val="0"/>
-          <w:numId w:val="30"/>
+          <w:numId w:val="31"/>
         </w:numPr>
         <w:spacing w:after="240" w:lineRule="auto"/>
         <w:ind w:left="720" w:hanging="360"/>
@@ -5342,8 +6079,8 @@
           <w:color w:val="000000"/>
         </w:rPr>
       </w:pPr>
-      <w:bookmarkStart w:colFirst="0" w:colLast="0" w:name="_s8ehcqwj4c1p" w:id="43"/>
-      <w:bookmarkEnd w:id="43"/>
+      <w:bookmarkStart w:colFirst="0" w:colLast="0" w:name="_s8ehcqwj4c1p" w:id="46"/>
+      <w:bookmarkEnd w:id="46"/>
       <w:r>
         <w:rPr>
           <w:b w:val="1"/>
@@ -5401,7 +6138,7 @@
       <w:pPr>
         <w:numPr>
           <w:ilvl w:val="0"/>
-          <w:numId w:val="32"/>
+          <w:numId w:val="33"/>
         </w:numPr>
         <w:spacing w:after="240" w:lineRule="auto"/>
         <w:ind w:left="720" w:hanging="360"/>
@@ -5438,7 +6175,7 @@
       <w:pPr>
         <w:numPr>
           <w:ilvl w:val="0"/>
-          <w:numId w:val="43"/>
+          <w:numId w:val="45"/>
         </w:numPr>
         <w:spacing w:after="0" w:afterAutospacing="0" w:lineRule="auto"/>
         <w:ind w:left="720" w:hanging="360"/>
@@ -5456,7 +6193,7 @@
       <w:pPr>
         <w:numPr>
           <w:ilvl w:val="0"/>
-          <w:numId w:val="43"/>
+          <w:numId w:val="45"/>
         </w:numPr>
         <w:spacing w:after="0" w:afterAutospacing="0" w:lineRule="auto"/>
         <w:ind w:left="720" w:hanging="360"/>
@@ -5474,7 +6211,7 @@
       <w:pPr>
         <w:numPr>
           <w:ilvl w:val="0"/>
-          <w:numId w:val="43"/>
+          <w:numId w:val="45"/>
         </w:numPr>
         <w:spacing w:after="240" w:lineRule="auto"/>
         <w:ind w:left="720" w:hanging="360"/>
@@ -5509,8 +6246,8 @@
           <w:color w:val="000000"/>
         </w:rPr>
       </w:pPr>
-      <w:bookmarkStart w:colFirst="0" w:colLast="0" w:name="_7n6d4l4wv6kb" w:id="44"/>
-      <w:bookmarkEnd w:id="44"/>
+      <w:bookmarkStart w:colFirst="0" w:colLast="0" w:name="_7n6d4l4wv6kb" w:id="47"/>
+      <w:bookmarkEnd w:id="47"/>
       <w:r>
         <w:rPr>
           <w:b w:val="1"/>
@@ -5659,7 +6396,7 @@
       <w:pPr>
         <w:numPr>
           <w:ilvl w:val="0"/>
-          <w:numId w:val="33"/>
+          <w:numId w:val="35"/>
         </w:numPr>
         <w:spacing w:after="0" w:afterAutospacing="0" w:lineRule="auto"/>
         <w:ind w:left="720" w:hanging="360"/>
@@ -5677,7 +6414,7 @@
       <w:pPr>
         <w:numPr>
           <w:ilvl w:val="0"/>
-          <w:numId w:val="33"/>
+          <w:numId w:val="35"/>
         </w:numPr>
         <w:spacing w:after="240" w:lineRule="auto"/>
         <w:ind w:left="720" w:hanging="360"/>
@@ -5712,8 +6449,8 @@
           <w:color w:val="000000"/>
         </w:rPr>
       </w:pPr>
-      <w:bookmarkStart w:colFirst="0" w:colLast="0" w:name="_wdp3r3w77va5" w:id="45"/>
-      <w:bookmarkEnd w:id="45"/>
+      <w:bookmarkStart w:colFirst="0" w:colLast="0" w:name="_wdp3r3w77va5" w:id="48"/>
+      <w:bookmarkEnd w:id="48"/>
       <w:r>
         <w:rPr>
           <w:b w:val="1"/>
@@ -5771,7 +6508,7 @@
       <w:pPr>
         <w:numPr>
           <w:ilvl w:val="0"/>
-          <w:numId w:val="38"/>
+          <w:numId w:val="40"/>
         </w:numPr>
         <w:spacing w:after="0" w:afterAutospacing="0" w:lineRule="auto"/>
         <w:ind w:left="720" w:hanging="360"/>
@@ -5788,7 +6525,7 @@
       <w:pPr>
         <w:numPr>
           <w:ilvl w:val="0"/>
-          <w:numId w:val="38"/>
+          <w:numId w:val="40"/>
         </w:numPr>
         <w:spacing w:after="240" w:lineRule="auto"/>
         <w:ind w:left="720" w:hanging="360"/>
@@ -5878,8 +6615,8 @@
           <w:color w:val="000000"/>
         </w:rPr>
       </w:pPr>
-      <w:bookmarkStart w:colFirst="0" w:colLast="0" w:name="_4sftqb2xeiuo" w:id="46"/>
-      <w:bookmarkEnd w:id="46"/>
+      <w:bookmarkStart w:colFirst="0" w:colLast="0" w:name="_4sftqb2xeiuo" w:id="49"/>
+      <w:bookmarkEnd w:id="49"/>
       <w:r>
         <w:rPr>
           <w:b w:val="1"/>
@@ -5937,7 +6674,7 @@
       <w:pPr>
         <w:numPr>
           <w:ilvl w:val="0"/>
-          <w:numId w:val="35"/>
+          <w:numId w:val="37"/>
         </w:numPr>
         <w:spacing w:after="240" w:lineRule="auto"/>
         <w:ind w:left="720" w:hanging="360"/>
@@ -5974,7 +6711,7 @@
       <w:pPr>
         <w:numPr>
           <w:ilvl w:val="0"/>
-          <w:numId w:val="39"/>
+          <w:numId w:val="41"/>
         </w:numPr>
         <w:spacing w:after="240" w:lineRule="auto"/>
         <w:ind w:left="720" w:hanging="360"/>
@@ -6011,7 +6748,7 @@
       <w:pPr>
         <w:numPr>
           <w:ilvl w:val="0"/>
-          <w:numId w:val="45"/>
+          <w:numId w:val="47"/>
         </w:numPr>
         <w:spacing w:after="0" w:afterAutospacing="0" w:lineRule="auto"/>
         <w:ind w:left="720" w:hanging="360"/>
@@ -6029,7 +6766,7 @@
       <w:pPr>
         <w:numPr>
           <w:ilvl w:val="0"/>
-          <w:numId w:val="45"/>
+          <w:numId w:val="47"/>
         </w:numPr>
         <w:spacing w:after="240" w:lineRule="auto"/>
         <w:ind w:left="720" w:hanging="360"/>
@@ -6053,8 +6790,8 @@
           <w:color w:val="000000"/>
         </w:rPr>
       </w:pPr>
-      <w:bookmarkStart w:colFirst="0" w:colLast="0" w:name="_z2s7trjafmx3" w:id="47"/>
-      <w:bookmarkEnd w:id="47"/>
+      <w:bookmarkStart w:colFirst="0" w:colLast="0" w:name="_z2s7trjafmx3" w:id="50"/>
+      <w:bookmarkEnd w:id="50"/>
       <w:r>
         <w:rPr>
           <w:b w:val="1"/>
@@ -6219,8 +6956,8 @@
           <w:color w:val="000000"/>
         </w:rPr>
       </w:pPr>
-      <w:bookmarkStart w:colFirst="0" w:colLast="0" w:name="_inlox6ocrseh" w:id="48"/>
-      <w:bookmarkEnd w:id="48"/>
+      <w:bookmarkStart w:colFirst="0" w:colLast="0" w:name="_inlox6ocrseh" w:id="51"/>
+      <w:bookmarkEnd w:id="51"/>
       <w:r>
         <w:rPr>
           <w:b w:val="1"/>
@@ -6308,11 +7045,104 @@
         <w:pStyle w:val="Heading3"/>
         <w:spacing w:after="240" w:before="240" w:lineRule="auto"/>
         <w:rPr>
+          <w:b w:val="1"/>
+          <w:bCs w:val="1"/>
           <w:color w:val="000000"/>
         </w:rPr>
       </w:pPr>
-      <w:bookmarkStart w:colFirst="0" w:colLast="0" w:name="_ehflr4fqbn7y" w:id="49"/>
-      <w:bookmarkEnd w:id="49"/>
+      <w:bookmarkStart w:colFirst="0" w:colLast="0" w:name="_lvgs39t9bo1t" w:id="52"/>
+      <w:bookmarkEnd w:id="52"/>
+      <w:r>
+        <w:rPr>
+          <w:b w:val="1"/>
+          <w:bCs w:val="1"/>
+          <w:color w:val="000000"/>
+          <w:rtl w:val="0"/>
+        </w:rPr>
+        <w:t xml:space="preserve">7.11 Versionamento do Banco de Dados</w:t>
+      </w:r>
+    </w:p>
+    <w:p>
+      <w:pPr>
+        <w:spacing w:after="240" w:before="240" w:lineRule="auto"/>
+        <w:rPr/>
+      </w:pPr>
+      <w:r>
+        <w:rPr>
+          <w:rtl w:val="0"/>
+        </w:rPr>
+        <w:t xml:space="preserve">A estrutura do banco de dados é versionada utilizando </w:t>
+      </w:r>
+      <w:r>
+        <w:rPr>
+          <w:b w:val="1"/>
+          <w:bCs w:val="1"/>
+          <w:rtl w:val="0"/>
+        </w:rPr>
+        <w:t xml:space="preserve">Knex Migrations</w:t>
+      </w:r>
+      <w:r>
+        <w:rPr>
+          <w:rtl w:val="0"/>
+        </w:rPr>
+        <w:t xml:space="preserve">.</w:t>
+      </w:r>
+    </w:p>
+    <w:p>
+      <w:pPr>
+        <w:spacing w:after="240" w:before="240" w:lineRule="auto"/>
+        <w:rPr/>
+      </w:pPr>
+      <w:r>
+        <w:rPr>
+          <w:rtl w:val="0"/>
+        </w:rPr>
+        <w:t xml:space="preserve">As migrações permitem acompanhar e reproduzir a evolução do esquema do banco de dados de forma controlada.</w:t>
+      </w:r>
+    </w:p>
+    <w:p>
+      <w:pPr>
+        <w:spacing w:after="240" w:before="240" w:lineRule="auto"/>
+        <w:rPr/>
+      </w:pPr>
+      <w:r>
+        <w:rPr>
+          <w:rtl w:val="0"/>
+        </w:rPr>
+        <w:t xml:space="preserve">Os dados iniciais da aplicação são gerenciados através de  </w:t>
+      </w:r>
+      <w:r>
+        <w:rPr>
+          <w:b w:val="1"/>
+          <w:bCs w:val="1"/>
+          <w:rtl w:val="0"/>
+        </w:rPr>
+        <w:t xml:space="preserve">Knex Seeds</w:t>
+      </w:r>
+      <w:r>
+        <w:rPr>
+          <w:rtl w:val="0"/>
+        </w:rPr>
+        <w:t xml:space="preserve">, permitindo separar a definição da estrutura do banco da carga inicial de dados.</w:t>
+      </w:r>
+    </w:p>
+    <w:p>
+      <w:pPr>
+        <w:spacing w:after="240" w:before="240" w:lineRule="auto"/>
+        <w:rPr/>
+      </w:pPr>
+      <w:r>
+        <w:rPr>
+          <w:rtl w:val="0"/>
+        </w:rPr>
+        <w:t xml:space="preserve">Esse mecanismo substitui a dependência de execução manual de scripts SQL para configuração inicial do banco.</w:t>
+      </w:r>
+    </w:p>
+    <w:p>
+      <w:pPr>
+        <w:spacing w:after="240" w:before="240" w:lineRule="auto"/>
+        <w:rPr/>
+      </w:pPr>
       <w:r>
         <w:rPr>
           <w:rtl w:val="0"/>
@@ -6328,8 +7158,8 @@
           <w:bCs w:val="1"/>
         </w:rPr>
       </w:pPr>
-      <w:bookmarkStart w:colFirst="0" w:colLast="0" w:name="_ptjzd3gra4iu" w:id="50"/>
-      <w:bookmarkEnd w:id="50"/>
+      <w:bookmarkStart w:colFirst="0" w:colLast="0" w:name="_ptjzd3gra4iu" w:id="53"/>
+      <w:bookmarkEnd w:id="53"/>
       <w:r>
         <w:rPr>
           <w:b w:val="1"/>
@@ -6470,21 +7300,59 @@
         <w:rPr>
           <w:rtl w:val="0"/>
         </w:rPr>
-        <w:t xml:space="preserve">Além disso, o uso de escopo de dados baseado no contexto do usuário garante que as informações sejam acessadas de forma</w:t>
-      </w:r>
-      <w:r>
-        <w:rPr>
-          <w:b w:val="1"/>
-          <w:bCs w:val="1"/>
-          <w:rtl w:val="0"/>
-        </w:rPr>
-        <w:t xml:space="preserve"> segura e adequada</w:t>
-      </w:r>
-      <w:r>
-        <w:rPr>
-          <w:rtl w:val="0"/>
-        </w:rPr>
-        <w:t xml:space="preserve"> aos diferentes níveis hierárquicos do sistema (Admin, Secretaria, Associação e Usuário). Tal abordagem demonstra maturidade técnica no tratamento de requisitos de segurança e privacidade, especialmente relevantes em sistemas de natureza institucional e governamental.</w:t>
+        <w:t xml:space="preserve">Além disso, a implementação do </w:t>
+      </w:r>
+      <w:r>
+        <w:rPr>
+          <w:b w:val="1"/>
+          <w:bCs w:val="1"/>
+          <w:rtl w:val="0"/>
+        </w:rPr>
+        <w:t xml:space="preserve">BaseScope</w:t>
+      </w:r>
+      <w:r>
+        <w:rPr>
+          <w:rtl w:val="0"/>
+        </w:rPr>
+        <w:t xml:space="preserve"> representa uma evolução importante na arquitetura de segurança do sistema. Os filtros de escopo passaram a ser aplicados diretamente nas consultas ao banco de dados, substituindo a abordagem anterior de filtragem posterior dos resultados.</w:t>
+      </w:r>
+    </w:p>
+    <w:p>
+      <w:pPr>
+        <w:spacing w:after="240" w:before="240" w:lineRule="auto"/>
+        <w:rPr/>
+      </w:pPr>
+      <w:r>
+        <w:rPr>
+          <w:rtl w:val="0"/>
+        </w:rPr>
+        <w:t xml:space="preserve">Essa alteração permite reduzir o volume de dados retornados e processados pela aplicação, contribuindo simultaneamente para a melhoria da performance e para o fortalecimento do isolamento dos dados.</w:t>
+      </w:r>
+    </w:p>
+    <w:p>
+      <w:pPr>
+        <w:spacing w:after="240" w:before="240" w:lineRule="auto"/>
+        <w:rPr/>
+      </w:pPr>
+      <w:r>
+        <w:rPr>
+          <w:rtl w:val="0"/>
+        </w:rPr>
+        <w:t xml:space="preserve">O mecanismo é aplicado de forma transversal aos endpoints que realizam consultas, permitindo que o acesso seja limitado de acordo com o contexto institucional do usuário, incluindo o escopo </w:t>
+      </w:r>
+      <w:r>
+        <w:rPr>
+          <w:b w:val="1"/>
+          <w:bCs w:val="1"/>
+          <w:rtl w:val="0"/>
+        </w:rPr>
+        <w:t xml:space="preserve">own</w:t>
+      </w:r>
+      <w:r>
+        <w:rPr>
+          <w:rtl w:val="0"/>
+        </w:rPr>
+        <w:t xml:space="preserve"> quando aplicável.</w:t>
       </w:r>
     </w:p>
     <w:p>
@@ -6503,7 +7371,7 @@
       <w:pPr>
         <w:numPr>
           <w:ilvl w:val="0"/>
-          <w:numId w:val="36"/>
+          <w:numId w:val="38"/>
         </w:numPr>
         <w:spacing w:after="0" w:afterAutospacing="0" w:lineRule="auto"/>
         <w:ind w:left="720" w:hanging="360"/>
@@ -6520,7 +7388,7 @@
       <w:pPr>
         <w:numPr>
           <w:ilvl w:val="0"/>
-          <w:numId w:val="36"/>
+          <w:numId w:val="38"/>
         </w:numPr>
         <w:spacing w:after="0" w:afterAutospacing="0" w:lineRule="auto"/>
         <w:ind w:left="720" w:hanging="360"/>
@@ -6537,7 +7405,7 @@
       <w:pPr>
         <w:numPr>
           <w:ilvl w:val="0"/>
-          <w:numId w:val="36"/>
+          <w:numId w:val="38"/>
         </w:numPr>
         <w:spacing w:after="0" w:afterAutospacing="0" w:lineRule="auto"/>
         <w:ind w:left="720" w:hanging="360"/>
@@ -6554,7 +7422,7 @@
       <w:pPr>
         <w:numPr>
           <w:ilvl w:val="0"/>
-          <w:numId w:val="36"/>
+          <w:numId w:val="38"/>
         </w:numPr>
         <w:spacing w:after="240" w:lineRule="auto"/>
         <w:ind w:left="720" w:hanging="360"/>
@@ -6630,8 +7498,8 @@
           <w:bCs w:val="1"/>
         </w:rPr>
       </w:pPr>
-      <w:bookmarkStart w:colFirst="0" w:colLast="0" w:name="_i5xz2zr7xj8d" w:id="51"/>
-      <w:bookmarkEnd w:id="51"/>
+      <w:bookmarkStart w:colFirst="0" w:colLast="0" w:name="_i5xz2zr7xj8d" w:id="54"/>
+      <w:bookmarkEnd w:id="54"/>
       <w:r>
         <w:rPr>
           <w:b w:val="1"/>
@@ -6790,6 +7658,8 @@
       </w:r>
     </w:p>
     <w:sectPr>
+      <w:headerReference r:id="rId7" w:type="default"/>
+      <w:footerReference r:id="rId8" w:type="default"/>
       <w:pgSz w:h="16834" w:w="11909" w:orient="portrait"/>
       <w:pgMar w:bottom="1440" w:top="1440" w:left="1440" w:right="1440" w:header="720" w:footer="720"/>
       <w:pgNumType w:start="1"/>
@@ -6798,6 +7668,36 @@
 </w:document>
 </file>
 
+<file path=word/footer1.xml><?xml version="1.0" encoding="utf-8"?>
+<w:ftr xmlns:mc="http://schemas.openxmlformats.org/markup-compatibility/2006" xmlns:o="urn:schemas-microsoft-com:office:office" xmlns:r="http://schemas.openxmlformats.org/officeDocument/2006/relationships" xmlns:m="http://schemas.openxmlformats.org/officeDocument/2006/math" xmlns:v="urn:schemas-microsoft-com:vml" xmlns:wp="http://schemas.openxmlformats.org/drawingml/2006/wordprocessingDrawing" xmlns:w10="urn:schemas-microsoft-com:office:word" xmlns:w="http://schemas.openxmlformats.org/wordprocessingml/2006/main" xmlns:wne="http://schemas.microsoft.com/office/word/2006/wordml" xmlns:sl="http://schemas.openxmlformats.org/schemaLibrary/2006/main" xmlns:a="http://schemas.openxmlformats.org/drawingml/2006/main" xmlns:pic="http://schemas.openxmlformats.org/drawingml/2006/picture" xmlns:c="http://schemas.openxmlformats.org/drawingml/2006/chart" xmlns:lc="http://schemas.openxmlformats.org/drawingml/2006/lockedCanvas" xmlns:dgm="http://schemas.openxmlformats.org/drawingml/2006/diagram" xmlns:wps="http://schemas.microsoft.com/office/word/2010/wordprocessingShape" xmlns:wpg="http://schemas.microsoft.com/office/word/2010/wordprocessingGroup" xmlns:w14="http://schemas.microsoft.com/office/word/2010/wordml" xmlns:w15="http://schemas.microsoft.com/office/word/2012/wordml" xmlns:w16="http://schemas.microsoft.com/office/word/2018/wordml" xmlns:w16cex="http://schemas.microsoft.com/office/word/2018/wordml/cex" xmlns:w16cid="http://schemas.microsoft.com/office/word/2016/wordml/cid" xmlns="http://schemas.microsoft.com/office/tasks/2019/documenttasks" xmlns:cr="http://schemas.microsoft.com/office/comments/2020/reactions">
+  <w:p>
+    <w:pPr>
+      <w:rPr/>
+    </w:pPr>
+    <w:r>
+      <w:rPr>
+        <w:rtl w:val="0"/>
+      </w:rPr>
+    </w:r>
+  </w:p>
+</w:ftr>
+</file>
+
+<file path=word/header1.xml><?xml version="1.0" encoding="utf-8"?>
+<w:hdr xmlns:mc="http://schemas.openxmlformats.org/markup-compatibility/2006" xmlns:o="urn:schemas-microsoft-com:office:office" xmlns:r="http://schemas.openxmlformats.org/officeDocument/2006/relationships" xmlns:m="http://schemas.openxmlformats.org/officeDocument/2006/math" xmlns:v="urn:schemas-microsoft-com:vml" xmlns:wp="http://schemas.openxmlformats.org/drawingml/2006/wordprocessingDrawing" xmlns:w10="urn:schemas-microsoft-com:office:word" xmlns:w="http://schemas.openxmlformats.org/wordprocessingml/2006/main" xmlns:wne="http://schemas.microsoft.com/office/word/2006/wordml" xmlns:sl="http://schemas.openxmlformats.org/schemaLibrary/2006/main" xmlns:a="http://schemas.openxmlformats.org/drawingml/2006/main" xmlns:pic="http://schemas.openxmlformats.org/drawingml/2006/picture" xmlns:c="http://schemas.openxmlformats.org/drawingml/2006/chart" xmlns:lc="http://schemas.openxmlformats.org/drawingml/2006/lockedCanvas" xmlns:dgm="http://schemas.openxmlformats.org/drawingml/2006/diagram" xmlns:wps="http://schemas.microsoft.com/office/word/2010/wordprocessingShape" xmlns:wpg="http://schemas.microsoft.com/office/word/2010/wordprocessingGroup" xmlns:w14="http://schemas.microsoft.com/office/word/2010/wordml" xmlns:w15="http://schemas.microsoft.com/office/word/2012/wordml" xmlns:w16="http://schemas.microsoft.com/office/word/2018/wordml" xmlns:w16cex="http://schemas.microsoft.com/office/word/2018/wordml/cex" xmlns:w16cid="http://schemas.microsoft.com/office/word/2016/wordml/cid" xmlns="http://schemas.microsoft.com/office/tasks/2019/documenttasks" xmlns:cr="http://schemas.microsoft.com/office/comments/2020/reactions">
+  <w:p>
+    <w:pPr>
+      <w:rPr/>
+    </w:pPr>
+    <w:r>
+      <w:rPr>
+        <w:rtl w:val="0"/>
+      </w:rPr>
+    </w:r>
+  </w:p>
+</w:hdr>
+</file>
+
 <file path=word/numbering.xml><?xml version="1.0" encoding="utf-8"?>
 <w:numbering xmlns:mc="http://schemas.openxmlformats.org/markup-compatibility/2006" xmlns:o="urn:schemas-microsoft-com:office:office" xmlns:r="http://schemas.openxmlformats.org/officeDocument/2006/relationships" xmlns:m="http://schemas.openxmlformats.org/officeDocument/2006/math" xmlns:v="urn:schemas-microsoft-com:vml" xmlns:wp="http://schemas.openxmlformats.org/drawingml/2006/wordprocessingDrawing" xmlns:w10="urn:schemas-microsoft-com:office:word" xmlns:w="http://schemas.openxmlformats.org/wordprocessingml/2006/main" xmlns:wne="http://schemas.microsoft.com/office/word/2006/wordml" xmlns:sl="http://schemas.openxmlformats.org/schemaLibrary/2006/main" xmlns:a="http://schemas.openxmlformats.org/drawingml/2006/main" xmlns:pic="http://schemas.openxmlformats.org/drawingml/2006/picture" xmlns:c="http://schemas.openxmlformats.org/drawingml/2006/chart" xmlns:lc="http://schemas.openxmlformats.org/drawingml/2006/lockedCanvas" xmlns:dgm="http://schemas.openxmlformats.org/drawingml/2006/diagram" xmlns:wps="http://schemas.microsoft.com/office/word/2010/wordprocessingShape" xmlns:wpg="http://schemas.microsoft.com/office/word/2010/wordprocessingGroup" xmlns:w14="http://schemas.microsoft.com/office/word/2010/wordml" xmlns:w15="http://schemas.microsoft.com/office/word/2012/wordml" xmlns:w16="http://schemas.microsoft.com/office/word/2018/wordml" xmlns:w16cex="http://schemas.microsoft.com/office/word/2018/wordml/cex" xmlns:w16cid="http://schemas.microsoft.com/office/word/2016/wordml/cid" xmlns="http://schemas.microsoft.com/office/tasks/2019/documenttasks" xmlns:cr="http://schemas.microsoft.com/office/comments/2020/reactions">
   <w:abstractNum w:abstractNumId="1">
@@ -11641,6 +12541,226 @@
     </w:lvl>
   </w:abstractNum>
   <w:abstractNum w:abstractNumId="45">
+    <w:lvl w:ilvl="0">
+      <w:start w:val="1"/>
+      <w:numFmt w:val="bullet"/>
+      <w:lvlText w:val="●"/>
+      <w:lvlJc w:val="left"/>
+      <w:pPr>
+        <w:ind w:left="720" w:hanging="360"/>
+      </w:pPr>
+      <w:rPr>
+        <w:u w:val="none"/>
+      </w:rPr>
+    </w:lvl>
+    <w:lvl w:ilvl="1">
+      <w:start w:val="1"/>
+      <w:numFmt w:val="bullet"/>
+      <w:lvlText w:val="○"/>
+      <w:lvlJc w:val="left"/>
+      <w:pPr>
+        <w:ind w:left="1440" w:hanging="360"/>
+      </w:pPr>
+      <w:rPr>
+        <w:u w:val="none"/>
+      </w:rPr>
+    </w:lvl>
+    <w:lvl w:ilvl="2">
+      <w:start w:val="1"/>
+      <w:numFmt w:val="bullet"/>
+      <w:lvlText w:val="■"/>
+      <w:lvlJc w:val="left"/>
+      <w:pPr>
+        <w:ind w:left="2160" w:hanging="360"/>
+      </w:pPr>
+      <w:rPr>
+        <w:u w:val="none"/>
+      </w:rPr>
+    </w:lvl>
+    <w:lvl w:ilvl="3">
+      <w:start w:val="1"/>
+      <w:numFmt w:val="bullet"/>
+      <w:lvlText w:val="●"/>
+      <w:lvlJc w:val="left"/>
+      <w:pPr>
+        <w:ind w:left="2880" w:hanging="360"/>
+      </w:pPr>
+      <w:rPr>
+        <w:u w:val="none"/>
+      </w:rPr>
+    </w:lvl>
+    <w:lvl w:ilvl="4">
+      <w:start w:val="1"/>
+      <w:numFmt w:val="bullet"/>
+      <w:lvlText w:val="○"/>
+      <w:lvlJc w:val="left"/>
+      <w:pPr>
+        <w:ind w:left="3600" w:hanging="360"/>
+      </w:pPr>
+      <w:rPr>
+        <w:u w:val="none"/>
+      </w:rPr>
+    </w:lvl>
+    <w:lvl w:ilvl="5">
+      <w:start w:val="1"/>
+      <w:numFmt w:val="bullet"/>
+      <w:lvlText w:val="■"/>
+      <w:lvlJc w:val="left"/>
+      <w:pPr>
+        <w:ind w:left="4320" w:hanging="360"/>
+      </w:pPr>
+      <w:rPr>
+        <w:u w:val="none"/>
+      </w:rPr>
+    </w:lvl>
+    <w:lvl w:ilvl="6">
+      <w:start w:val="1"/>
+      <w:numFmt w:val="bullet"/>
+      <w:lvlText w:val="●"/>
+      <w:lvlJc w:val="left"/>
+      <w:pPr>
+        <w:ind w:left="5040" w:hanging="360"/>
+      </w:pPr>
+      <w:rPr>
+        <w:u w:val="none"/>
+      </w:rPr>
+    </w:lvl>
+    <w:lvl w:ilvl="7">
+      <w:start w:val="1"/>
+      <w:numFmt w:val="bullet"/>
+      <w:lvlText w:val="○"/>
+      <w:lvlJc w:val="left"/>
+      <w:pPr>
+        <w:ind w:left="5760" w:hanging="360"/>
+      </w:pPr>
+      <w:rPr>
+        <w:u w:val="none"/>
+      </w:rPr>
+    </w:lvl>
+    <w:lvl w:ilvl="8">
+      <w:start w:val="1"/>
+      <w:numFmt w:val="bullet"/>
+      <w:lvlText w:val="■"/>
+      <w:lvlJc w:val="left"/>
+      <w:pPr>
+        <w:ind w:left="6480" w:hanging="360"/>
+      </w:pPr>
+      <w:rPr>
+        <w:u w:val="none"/>
+      </w:rPr>
+    </w:lvl>
+  </w:abstractNum>
+  <w:abstractNum w:abstractNumId="46">
+    <w:lvl w:ilvl="0">
+      <w:start w:val="1"/>
+      <w:numFmt w:val="bullet"/>
+      <w:lvlText w:val="●"/>
+      <w:lvlJc w:val="left"/>
+      <w:pPr>
+        <w:ind w:left="720" w:hanging="360"/>
+      </w:pPr>
+      <w:rPr>
+        <w:u w:val="none"/>
+      </w:rPr>
+    </w:lvl>
+    <w:lvl w:ilvl="1">
+      <w:start w:val="1"/>
+      <w:numFmt w:val="bullet"/>
+      <w:lvlText w:val="○"/>
+      <w:lvlJc w:val="left"/>
+      <w:pPr>
+        <w:ind w:left="1440" w:hanging="360"/>
+      </w:pPr>
+      <w:rPr>
+        <w:u w:val="none"/>
+      </w:rPr>
+    </w:lvl>
+    <w:lvl w:ilvl="2">
+      <w:start w:val="1"/>
+      <w:numFmt w:val="bullet"/>
+      <w:lvlText w:val="■"/>
+      <w:lvlJc w:val="left"/>
+      <w:pPr>
+        <w:ind w:left="2160" w:hanging="360"/>
+      </w:pPr>
+      <w:rPr>
+        <w:u w:val="none"/>
+      </w:rPr>
+    </w:lvl>
+    <w:lvl w:ilvl="3">
+      <w:start w:val="1"/>
+      <w:numFmt w:val="bullet"/>
+      <w:lvlText w:val="●"/>
+      <w:lvlJc w:val="left"/>
+      <w:pPr>
+        <w:ind w:left="2880" w:hanging="360"/>
+      </w:pPr>
+      <w:rPr>
+        <w:u w:val="none"/>
+      </w:rPr>
+    </w:lvl>
+    <w:lvl w:ilvl="4">
+      <w:start w:val="1"/>
+      <w:numFmt w:val="bullet"/>
+      <w:lvlText w:val="○"/>
+      <w:lvlJc w:val="left"/>
+      <w:pPr>
+        <w:ind w:left="3600" w:hanging="360"/>
+      </w:pPr>
+      <w:rPr>
+        <w:u w:val="none"/>
+      </w:rPr>
+    </w:lvl>
+    <w:lvl w:ilvl="5">
+      <w:start w:val="1"/>
+      <w:numFmt w:val="bullet"/>
+      <w:lvlText w:val="■"/>
+      <w:lvlJc w:val="left"/>
+      <w:pPr>
+        <w:ind w:left="4320" w:hanging="360"/>
+      </w:pPr>
+      <w:rPr>
+        <w:u w:val="none"/>
+      </w:rPr>
+    </w:lvl>
+    <w:lvl w:ilvl="6">
+      <w:start w:val="1"/>
+      <w:numFmt w:val="bullet"/>
+      <w:lvlText w:val="●"/>
+      <w:lvlJc w:val="left"/>
+      <w:pPr>
+        <w:ind w:left="5040" w:hanging="360"/>
+      </w:pPr>
+      <w:rPr>
+        <w:u w:val="none"/>
+      </w:rPr>
+    </w:lvl>
+    <w:lvl w:ilvl="7">
+      <w:start w:val="1"/>
+      <w:numFmt w:val="bullet"/>
+      <w:lvlText w:val="○"/>
+      <w:lvlJc w:val="left"/>
+      <w:pPr>
+        <w:ind w:left="5760" w:hanging="360"/>
+      </w:pPr>
+      <w:rPr>
+        <w:u w:val="none"/>
+      </w:rPr>
+    </w:lvl>
+    <w:lvl w:ilvl="8">
+      <w:start w:val="1"/>
+      <w:numFmt w:val="bullet"/>
+      <w:lvlText w:val="■"/>
+      <w:lvlJc w:val="left"/>
+      <w:pPr>
+        <w:ind w:left="6480" w:hanging="360"/>
+      </w:pPr>
+      <w:rPr>
+        <w:u w:val="none"/>
+      </w:rPr>
+    </w:lvl>
+  </w:abstractNum>
+  <w:abstractNum w:abstractNumId="47">
     <w:lvl w:ilvl="0">
       <w:start w:val="1"/>
       <w:numFmt w:val="bullet"/>
@@ -11884,6 +13004,12 @@
   </w:num>
   <w:num w:numId="45">
     <w:abstractNumId w:val="45"/>
+  </w:num>
+  <w:num w:numId="46">
+    <w:abstractNumId w:val="46"/>
+  </w:num>
+  <w:num w:numId="47">
+    <w:abstractNumId w:val="47"/>
   </w:num>
 </w:numbering>
 </file>

</xml_diff>